<commit_message>
Replace Post Mortem Analyse.docx
</commit_message>
<xml_diff>
--- a/Project-organisation/Post Mortem Analyse.docx
+++ b/Project-organisation/Post Mortem Analyse.docx
@@ -1,714 +1,577 @@
 
 <file path=word/document.xml><?xml version="1.0" encoding="utf-8"?>
-<w:document xmlns:mc="http://schemas.openxmlformats.org/markup-compatibility/2006" xmlns:o="urn:schemas-microsoft-com:office:office" xmlns:r="http://schemas.openxmlformats.org/officeDocument/2006/relationships" xmlns:m="http://schemas.openxmlformats.org/officeDocument/2006/math" xmlns:v="urn:schemas-microsoft-com:vml" xmlns:wp="http://schemas.openxmlformats.org/drawingml/2006/wordprocessingDrawing" xmlns:w10="urn:schemas-microsoft-com:office:word" xmlns:w="http://schemas.openxmlformats.org/wordprocessingml/2006/main" xmlns:wne="http://schemas.microsoft.com/office/word/2006/wordml" xmlns:sl="http://schemas.openxmlformats.org/schemaLibrary/2006/main" xmlns:a="http://schemas.openxmlformats.org/drawingml/2006/main" xmlns:pic="http://schemas.openxmlformats.org/drawingml/2006/picture" xmlns:c="http://schemas.openxmlformats.org/drawingml/2006/chart" xmlns:lc="http://schemas.openxmlformats.org/drawingml/2006/lockedCanvas" xmlns:dgm="http://schemas.openxmlformats.org/drawingml/2006/diagram" xmlns:wps="http://schemas.microsoft.com/office/word/2010/wordprocessingShape" xmlns:wpg="http://schemas.microsoft.com/office/word/2010/wordprocessingGroup" xmlns:w14="http://schemas.microsoft.com/office/word/2010/wordml" xmlns:w15="http://schemas.microsoft.com/office/word/2012/wordml" xmlns:w16="http://schemas.microsoft.com/office/word/2018/wordml" xmlns:w16cex="http://schemas.microsoft.com/office/word/2018/wordml/cex" xmlns:w16cid="http://schemas.microsoft.com/office/word/2016/wordml/cid" xmlns="http://schemas.microsoft.com/office/tasks/2019/documenttasks" xmlns:cr="http://schemas.microsoft.com/office/comments/2020/reactions">
+<w:document xmlns:wpc="http://schemas.microsoft.com/office/word/2010/wordprocessingCanvas" xmlns:cx="http://schemas.microsoft.com/office/drawing/2014/chartex" xmlns:cx1="http://schemas.microsoft.com/office/drawing/2015/9/8/chartex" xmlns:cx2="http://schemas.microsoft.com/office/drawing/2015/10/21/chartex" xmlns:cx3="http://schemas.microsoft.com/office/drawing/2016/5/9/chartex" xmlns:cx4="http://schemas.microsoft.com/office/drawing/2016/5/10/chartex" xmlns:cx5="http://schemas.microsoft.com/office/drawing/2016/5/11/chartex" xmlns:cx6="http://schemas.microsoft.com/office/drawing/2016/5/12/chartex" xmlns:cx7="http://schemas.microsoft.com/office/drawing/2016/5/13/chartex" xmlns:cx8="http://schemas.microsoft.com/office/drawing/2016/5/14/chartex" xmlns:mc="http://schemas.openxmlformats.org/markup-compatibility/2006" xmlns:aink="http://schemas.microsoft.com/office/drawing/2016/ink" xmlns:am3d="http://schemas.microsoft.com/office/drawing/2017/model3d" xmlns:o="urn:schemas-microsoft-com:office:office" xmlns:oel="http://schemas.microsoft.com/office/2019/extlst" xmlns:r="http://schemas.openxmlformats.org/officeDocument/2006/relationships" xmlns:m="http://schemas.openxmlformats.org/officeDocument/2006/math" xmlns:v="urn:schemas-microsoft-com:vml" xmlns:wp14="http://schemas.microsoft.com/office/word/2010/wordprocessingDrawing" xmlns:wp="http://schemas.openxmlformats.org/drawingml/2006/wordprocessingDrawing" xmlns:w10="urn:schemas-microsoft-com:office:word" xmlns:w="http://schemas.openxmlformats.org/wordprocessingml/2006/main" xmlns:w14="http://schemas.microsoft.com/office/word/2010/wordml" xmlns:w15="http://schemas.microsoft.com/office/word/2012/wordml" xmlns:w16cex="http://schemas.microsoft.com/office/word/2018/wordml/cex" xmlns:w16cid="http://schemas.microsoft.com/office/word/2016/wordml/cid" xmlns:w16="http://schemas.microsoft.com/office/word/2018/wordml" xmlns:w16du="http://schemas.microsoft.com/office/word/2023/wordml/word16du" xmlns:w16sdtdh="http://schemas.microsoft.com/office/word/2020/wordml/sdtdatahash" xmlns:w16sdtfl="http://schemas.microsoft.com/office/word/2024/wordml/sdtformatlock" xmlns:w16se="http://schemas.microsoft.com/office/word/2015/wordml/symex" xmlns:wpg="http://schemas.microsoft.com/office/word/2010/wordprocessingGroup" xmlns:wpi="http://schemas.microsoft.com/office/word/2010/wordprocessingInk" xmlns:wne="http://schemas.microsoft.com/office/word/2006/wordml" xmlns:wps="http://schemas.microsoft.com/office/word/2010/wordprocessingShape" mc:Ignorable="w14 w15 w16se w16cid w16 w16cex w16sdtdh w16sdtfl w16du wp14">
   <w:body>
     <w:p>
       <w:pPr>
-        <w:pStyle w:val="Heading1"/>
-        <w:rPr/>
-      </w:pPr>
-      <w:bookmarkStart w:colFirst="0" w:colLast="0" w:name="_e9tdxzd5p682" w:id="0"/>
+        <w:pStyle w:val="berschrift1"/>
+      </w:pPr>
+      <w:bookmarkStart w:id="0" w:name="_e9tdxzd5p682" w:colFirst="0" w:colLast="0"/>
       <w:bookmarkEnd w:id="0"/>
       <w:r>
-        <w:rPr>
-          <w:rtl w:val="0"/>
-        </w:rPr>
-        <w:t xml:space="preserve">Post Mortem Analyse</w:t>
+        <w:t>Post Mortem Analyse</w:t>
       </w:r>
     </w:p>
     <w:tbl>
       <w:tblPr>
-        <w:tblStyle w:val="Table1"/>
-        <w:tblW w:w="9029.0" w:type="dxa"/>
-        <w:jc w:val="left"/>
+        <w:tblStyle w:val="a"/>
+        <w:tblW w:w="9029" w:type="dxa"/>
+        <w:tblInd w:w="0" w:type="dxa"/>
         <w:tblBorders>
-          <w:top w:color="000000" w:space="0" w:sz="8" w:val="single"/>
-          <w:left w:color="000000" w:space="0" w:sz="8" w:val="single"/>
-          <w:bottom w:color="000000" w:space="0" w:sz="8" w:val="single"/>
-          <w:right w:color="000000" w:space="0" w:sz="8" w:val="single"/>
-          <w:insideH w:color="000000" w:space="0" w:sz="8" w:val="single"/>
-          <w:insideV w:color="000000" w:space="0" w:sz="8" w:val="single"/>
+          <w:top w:val="single" w:sz="8" w:space="0" w:color="000000"/>
+          <w:left w:val="single" w:sz="8" w:space="0" w:color="000000"/>
+          <w:bottom w:val="single" w:sz="8" w:space="0" w:color="000000"/>
+          <w:right w:val="single" w:sz="8" w:space="0" w:color="000000"/>
+          <w:insideH w:val="single" w:sz="8" w:space="0" w:color="000000"/>
+          <w:insideV w:val="single" w:sz="8" w:space="0" w:color="000000"/>
         </w:tblBorders>
         <w:tblLayout w:type="fixed"/>
-        <w:tblLook w:val="0600"/>
+        <w:tblLook w:val="0600" w:firstRow="0" w:lastRow="0" w:firstColumn="0" w:lastColumn="0" w:noHBand="1" w:noVBand="1"/>
       </w:tblPr>
       <w:tblGrid>
-        <w:gridCol w:w="4514.5"/>
-        <w:gridCol w:w="4514.5"/>
-        <w:tblGridChange w:id="0">
-          <w:tblGrid>
-            <w:gridCol w:w="4514.5"/>
-            <w:gridCol w:w="4514.5"/>
-          </w:tblGrid>
-        </w:tblGridChange>
+        <w:gridCol w:w="4514"/>
+        <w:gridCol w:w="4515"/>
       </w:tblGrid>
       <w:tr>
         <w:trPr>
-          <w:cantSplit w:val="0"/>
-          <w:tblHeader w:val="1"/>
+          <w:tblHeader/>
         </w:trPr>
         <w:tc>
           <w:tcPr>
-            <w:shd w:fill="auto" w:val="clear"/>
+            <w:tcW w:w="4514" w:type="dxa"/>
+            <w:shd w:val="clear" w:color="auto" w:fill="auto"/>
             <w:tcMar>
-              <w:top w:w="100.0" w:type="dxa"/>
-              <w:left w:w="100.0" w:type="dxa"/>
-              <w:bottom w:w="100.0" w:type="dxa"/>
-              <w:right w:w="100.0" w:type="dxa"/>
+              <w:top w:w="100" w:type="dxa"/>
+              <w:left w:w="100" w:type="dxa"/>
+              <w:bottom w:w="100" w:type="dxa"/>
+              <w:right w:w="100" w:type="dxa"/>
             </w:tcMar>
-            <w:vAlign w:val="top"/>
           </w:tcPr>
           <w:p>
             <w:pPr>
               <w:widowControl w:val="0"/>
               <w:spacing w:line="240" w:lineRule="auto"/>
-              <w:rPr/>
             </w:pPr>
             <w:r>
-              <w:rPr>
-                <w:rtl w:val="0"/>
-              </w:rPr>
-              <w:t xml:space="preserve">Projektbezeichnung</w:t>
+              <w:t>Projektbezeichnung</w:t>
             </w:r>
           </w:p>
         </w:tc>
         <w:tc>
           <w:tcPr>
-            <w:shd w:fill="auto" w:val="clear"/>
+            <w:tcW w:w="4514" w:type="dxa"/>
+            <w:shd w:val="clear" w:color="auto" w:fill="auto"/>
             <w:tcMar>
-              <w:top w:w="100.0" w:type="dxa"/>
-              <w:left w:w="100.0" w:type="dxa"/>
-              <w:bottom w:w="100.0" w:type="dxa"/>
-              <w:right w:w="100.0" w:type="dxa"/>
+              <w:top w:w="100" w:type="dxa"/>
+              <w:left w:w="100" w:type="dxa"/>
+              <w:bottom w:w="100" w:type="dxa"/>
+              <w:right w:w="100" w:type="dxa"/>
             </w:tcMar>
-            <w:vAlign w:val="top"/>
           </w:tcPr>
           <w:p>
             <w:pPr>
               <w:widowControl w:val="0"/>
               <w:spacing w:line="240" w:lineRule="auto"/>
-              <w:rPr/>
             </w:pPr>
             <w:r>
-              <w:rPr>
-                <w:rtl w:val="0"/>
-              </w:rPr>
-              <w:t xml:space="preserve">Spritzgussmaschine</w:t>
+              <w:t>Spritzgussmaschine</w:t>
             </w:r>
           </w:p>
         </w:tc>
       </w:tr>
       <w:tr>
         <w:trPr>
-          <w:cantSplit w:val="0"/>
-          <w:tblHeader w:val="1"/>
+          <w:tblHeader/>
         </w:trPr>
         <w:tc>
           <w:tcPr>
-            <w:shd w:fill="auto" w:val="clear"/>
+            <w:tcW w:w="4514" w:type="dxa"/>
+            <w:shd w:val="clear" w:color="auto" w:fill="auto"/>
             <w:tcMar>
-              <w:top w:w="100.0" w:type="dxa"/>
-              <w:left w:w="100.0" w:type="dxa"/>
-              <w:bottom w:w="100.0" w:type="dxa"/>
-              <w:right w:w="100.0" w:type="dxa"/>
+              <w:top w:w="100" w:type="dxa"/>
+              <w:left w:w="100" w:type="dxa"/>
+              <w:bottom w:w="100" w:type="dxa"/>
+              <w:right w:w="100" w:type="dxa"/>
             </w:tcMar>
-            <w:vAlign w:val="top"/>
           </w:tcPr>
           <w:p>
             <w:pPr>
               <w:widowControl w:val="0"/>
               <w:spacing w:line="240" w:lineRule="auto"/>
-              <w:rPr/>
             </w:pPr>
             <w:r>
-              <w:rPr>
-                <w:rtl w:val="0"/>
-              </w:rPr>
-              <w:t xml:space="preserve">Projektverantwortlicher</w:t>
+              <w:t>Projektverantwortlicher</w:t>
             </w:r>
           </w:p>
         </w:tc>
         <w:tc>
           <w:tcPr>
-            <w:shd w:fill="auto" w:val="clear"/>
+            <w:tcW w:w="4514" w:type="dxa"/>
+            <w:shd w:val="clear" w:color="auto" w:fill="auto"/>
             <w:tcMar>
-              <w:top w:w="100.0" w:type="dxa"/>
-              <w:left w:w="100.0" w:type="dxa"/>
-              <w:bottom w:w="100.0" w:type="dxa"/>
-              <w:right w:w="100.0" w:type="dxa"/>
+              <w:top w:w="100" w:type="dxa"/>
+              <w:left w:w="100" w:type="dxa"/>
+              <w:bottom w:w="100" w:type="dxa"/>
+              <w:right w:w="100" w:type="dxa"/>
             </w:tcMar>
-            <w:vAlign w:val="top"/>
           </w:tcPr>
           <w:p>
             <w:pPr>
               <w:widowControl w:val="0"/>
               <w:spacing w:line="240" w:lineRule="auto"/>
-              <w:rPr/>
             </w:pPr>
             <w:r>
-              <w:rPr>
-                <w:rtl w:val="0"/>
-              </w:rPr>
-              <w:t xml:space="preserve">Armin Anton</w:t>
+              <w:t>Armin Anton</w:t>
             </w:r>
           </w:p>
         </w:tc>
       </w:tr>
       <w:tr>
-        <w:trPr>
-          <w:cantSplit w:val="0"/>
-          <w:tblHeader w:val="0"/>
-        </w:trPr>
         <w:tc>
           <w:tcPr>
-            <w:shd w:fill="auto" w:val="clear"/>
+            <w:tcW w:w="4514" w:type="dxa"/>
+            <w:shd w:val="clear" w:color="auto" w:fill="auto"/>
             <w:tcMar>
-              <w:top w:w="100.0" w:type="dxa"/>
-              <w:left w:w="100.0" w:type="dxa"/>
-              <w:bottom w:w="100.0" w:type="dxa"/>
-              <w:right w:w="100.0" w:type="dxa"/>
+              <w:top w:w="100" w:type="dxa"/>
+              <w:left w:w="100" w:type="dxa"/>
+              <w:bottom w:w="100" w:type="dxa"/>
+              <w:right w:w="100" w:type="dxa"/>
             </w:tcMar>
-            <w:vAlign w:val="top"/>
           </w:tcPr>
           <w:p>
             <w:pPr>
               <w:widowControl w:val="0"/>
               <w:spacing w:line="240" w:lineRule="auto"/>
-              <w:rPr/>
             </w:pPr>
             <w:r>
-              <w:rPr>
-                <w:rtl w:val="0"/>
-              </w:rPr>
-              <w:t xml:space="preserve">Verantwortlicher Post Mortem Analyse</w:t>
+              <w:t>Verantwortlicher Post Mortem Analyse</w:t>
             </w:r>
           </w:p>
         </w:tc>
         <w:tc>
           <w:tcPr>
-            <w:shd w:fill="auto" w:val="clear"/>
+            <w:tcW w:w="4514" w:type="dxa"/>
+            <w:shd w:val="clear" w:color="auto" w:fill="auto"/>
             <w:tcMar>
-              <w:top w:w="100.0" w:type="dxa"/>
-              <w:left w:w="100.0" w:type="dxa"/>
-              <w:bottom w:w="100.0" w:type="dxa"/>
-              <w:right w:w="100.0" w:type="dxa"/>
+              <w:top w:w="100" w:type="dxa"/>
+              <w:left w:w="100" w:type="dxa"/>
+              <w:bottom w:w="100" w:type="dxa"/>
+              <w:right w:w="100" w:type="dxa"/>
             </w:tcMar>
-            <w:vAlign w:val="top"/>
           </w:tcPr>
           <w:p>
             <w:pPr>
               <w:widowControl w:val="0"/>
               <w:spacing w:line="240" w:lineRule="auto"/>
-              <w:rPr/>
             </w:pPr>
             <w:r>
-              <w:rPr>
-                <w:rtl w:val="0"/>
-              </w:rPr>
-              <w:t xml:space="preserve">Jan Benz</w:t>
+              <w:t>Jan Benz</w:t>
             </w:r>
           </w:p>
         </w:tc>
       </w:tr>
       <w:tr>
-        <w:trPr>
-          <w:cantSplit w:val="0"/>
-          <w:tblHeader w:val="0"/>
-        </w:trPr>
         <w:tc>
           <w:tcPr>
-            <w:shd w:fill="auto" w:val="clear"/>
+            <w:tcW w:w="4514" w:type="dxa"/>
+            <w:shd w:val="clear" w:color="auto" w:fill="auto"/>
             <w:tcMar>
-              <w:top w:w="100.0" w:type="dxa"/>
-              <w:left w:w="100.0" w:type="dxa"/>
-              <w:bottom w:w="100.0" w:type="dxa"/>
-              <w:right w:w="100.0" w:type="dxa"/>
+              <w:top w:w="100" w:type="dxa"/>
+              <w:left w:w="100" w:type="dxa"/>
+              <w:bottom w:w="100" w:type="dxa"/>
+              <w:right w:w="100" w:type="dxa"/>
             </w:tcMar>
-            <w:vAlign w:val="top"/>
           </w:tcPr>
           <w:p>
             <w:pPr>
               <w:widowControl w:val="0"/>
               <w:spacing w:line="240" w:lineRule="auto"/>
-              <w:rPr/>
             </w:pPr>
             <w:r>
-              <w:rPr>
-                <w:rtl w:val="0"/>
-              </w:rPr>
-              <w:t xml:space="preserve">Erstellt am</w:t>
+              <w:t>Erstellt am</w:t>
             </w:r>
           </w:p>
         </w:tc>
         <w:tc>
           <w:tcPr>
-            <w:shd w:fill="auto" w:val="clear"/>
+            <w:tcW w:w="4514" w:type="dxa"/>
+            <w:shd w:val="clear" w:color="auto" w:fill="auto"/>
             <w:tcMar>
-              <w:top w:w="100.0" w:type="dxa"/>
-              <w:left w:w="100.0" w:type="dxa"/>
-              <w:bottom w:w="100.0" w:type="dxa"/>
-              <w:right w:w="100.0" w:type="dxa"/>
+              <w:top w:w="100" w:type="dxa"/>
+              <w:left w:w="100" w:type="dxa"/>
+              <w:bottom w:w="100" w:type="dxa"/>
+              <w:right w:w="100" w:type="dxa"/>
             </w:tcMar>
-            <w:vAlign w:val="top"/>
           </w:tcPr>
           <w:p>
             <w:pPr>
               <w:widowControl w:val="0"/>
               <w:spacing w:line="240" w:lineRule="auto"/>
-              <w:rPr/>
             </w:pPr>
             <w:r>
-              <w:rPr>
-                <w:rtl w:val="0"/>
-              </w:rPr>
-              <w:t xml:space="preserve">26.06.2025</w:t>
+              <w:t>26.06.2025</w:t>
             </w:r>
           </w:p>
         </w:tc>
       </w:tr>
       <w:tr>
-        <w:trPr>
-          <w:cantSplit w:val="0"/>
-          <w:tblHeader w:val="0"/>
-        </w:trPr>
         <w:tc>
           <w:tcPr>
-            <w:shd w:fill="auto" w:val="clear"/>
+            <w:tcW w:w="4514" w:type="dxa"/>
+            <w:shd w:val="clear" w:color="auto" w:fill="auto"/>
             <w:tcMar>
-              <w:top w:w="100.0" w:type="dxa"/>
-              <w:left w:w="100.0" w:type="dxa"/>
-              <w:bottom w:w="100.0" w:type="dxa"/>
-              <w:right w:w="100.0" w:type="dxa"/>
+              <w:top w:w="100" w:type="dxa"/>
+              <w:left w:w="100" w:type="dxa"/>
+              <w:bottom w:w="100" w:type="dxa"/>
+              <w:right w:w="100" w:type="dxa"/>
             </w:tcMar>
-            <w:vAlign w:val="top"/>
           </w:tcPr>
           <w:p>
             <w:pPr>
               <w:widowControl w:val="0"/>
               <w:spacing w:line="240" w:lineRule="auto"/>
-              <w:rPr/>
             </w:pPr>
             <w:r>
-              <w:rPr>
-                <w:rtl w:val="0"/>
-              </w:rPr>
-              <w:t xml:space="preserve">Zuletzt geändert</w:t>
+              <w:t>Zuletzt geändert</w:t>
             </w:r>
           </w:p>
         </w:tc>
         <w:tc>
           <w:tcPr>
-            <w:shd w:fill="auto" w:val="clear"/>
+            <w:tcW w:w="4514" w:type="dxa"/>
+            <w:shd w:val="clear" w:color="auto" w:fill="auto"/>
             <w:tcMar>
-              <w:top w:w="100.0" w:type="dxa"/>
-              <w:left w:w="100.0" w:type="dxa"/>
-              <w:bottom w:w="100.0" w:type="dxa"/>
-              <w:right w:w="100.0" w:type="dxa"/>
+              <w:top w:w="100" w:type="dxa"/>
+              <w:left w:w="100" w:type="dxa"/>
+              <w:bottom w:w="100" w:type="dxa"/>
+              <w:right w:w="100" w:type="dxa"/>
             </w:tcMar>
-            <w:vAlign w:val="top"/>
           </w:tcPr>
           <w:p>
             <w:pPr>
               <w:widowControl w:val="0"/>
               <w:spacing w:line="240" w:lineRule="auto"/>
-              <w:rPr/>
             </w:pPr>
             <w:r>
-              <w:rPr>
-                <w:rtl w:val="0"/>
-              </w:rPr>
-              <w:t xml:space="preserve">26.06.2025</w:t>
+              <w:t>26.06.2025</w:t>
             </w:r>
           </w:p>
         </w:tc>
       </w:tr>
       <w:tr>
-        <w:trPr>
-          <w:cantSplit w:val="0"/>
-          <w:tblHeader w:val="0"/>
-        </w:trPr>
         <w:tc>
           <w:tcPr>
-            <w:shd w:fill="auto" w:val="clear"/>
+            <w:tcW w:w="4514" w:type="dxa"/>
+            <w:shd w:val="clear" w:color="auto" w:fill="auto"/>
             <w:tcMar>
-              <w:top w:w="100.0" w:type="dxa"/>
-              <w:left w:w="100.0" w:type="dxa"/>
-              <w:bottom w:w="100.0" w:type="dxa"/>
-              <w:right w:w="100.0" w:type="dxa"/>
+              <w:top w:w="100" w:type="dxa"/>
+              <w:left w:w="100" w:type="dxa"/>
+              <w:bottom w:w="100" w:type="dxa"/>
+              <w:right w:w="100" w:type="dxa"/>
             </w:tcMar>
-            <w:vAlign w:val="top"/>
           </w:tcPr>
           <w:p>
             <w:pPr>
               <w:widowControl w:val="0"/>
               <w:spacing w:line="240" w:lineRule="auto"/>
-              <w:rPr/>
             </w:pPr>
             <w:r>
-              <w:rPr>
-                <w:rtl w:val="0"/>
-              </w:rPr>
-              <w:t xml:space="preserve">Bearbeitungszustand</w:t>
+              <w:t>Bearbeitungszustand</w:t>
             </w:r>
           </w:p>
         </w:tc>
         <w:tc>
           <w:tcPr>
-            <w:shd w:fill="auto" w:val="clear"/>
+            <w:tcW w:w="4514" w:type="dxa"/>
+            <w:shd w:val="clear" w:color="auto" w:fill="auto"/>
             <w:tcMar>
-              <w:top w:w="100.0" w:type="dxa"/>
-              <w:left w:w="100.0" w:type="dxa"/>
-              <w:bottom w:w="100.0" w:type="dxa"/>
-              <w:right w:w="100.0" w:type="dxa"/>
+              <w:top w:w="100" w:type="dxa"/>
+              <w:left w:w="100" w:type="dxa"/>
+              <w:bottom w:w="100" w:type="dxa"/>
+              <w:right w:w="100" w:type="dxa"/>
             </w:tcMar>
-            <w:vAlign w:val="top"/>
           </w:tcPr>
           <w:p>
             <w:pPr>
               <w:widowControl w:val="0"/>
               <w:spacing w:line="240" w:lineRule="auto"/>
-              <w:rPr/>
             </w:pPr>
             <w:r>
-              <w:rPr>
-                <w:rtl w:val="0"/>
-              </w:rPr>
-              <w:t xml:space="preserve">In Bearbeitung</w:t>
+              <w:t>In Bearbeitung</w:t>
             </w:r>
           </w:p>
         </w:tc>
       </w:tr>
       <w:tr>
-        <w:trPr>
-          <w:cantSplit w:val="0"/>
-          <w:tblHeader w:val="0"/>
-        </w:trPr>
         <w:tc>
           <w:tcPr>
-            <w:shd w:fill="auto" w:val="clear"/>
+            <w:tcW w:w="4514" w:type="dxa"/>
+            <w:shd w:val="clear" w:color="auto" w:fill="auto"/>
             <w:tcMar>
-              <w:top w:w="100.0" w:type="dxa"/>
-              <w:left w:w="100.0" w:type="dxa"/>
-              <w:bottom w:w="100.0" w:type="dxa"/>
-              <w:right w:w="100.0" w:type="dxa"/>
+              <w:top w:w="100" w:type="dxa"/>
+              <w:left w:w="100" w:type="dxa"/>
+              <w:bottom w:w="100" w:type="dxa"/>
+              <w:right w:w="100" w:type="dxa"/>
             </w:tcMar>
-            <w:vAlign w:val="top"/>
           </w:tcPr>
           <w:p>
             <w:pPr>
               <w:widowControl w:val="0"/>
               <w:spacing w:line="240" w:lineRule="auto"/>
-              <w:rPr/>
             </w:pPr>
             <w:r>
-              <w:rPr>
-                <w:rtl w:val="0"/>
-              </w:rPr>
-              <w:t xml:space="preserve">Dokumentenbezeichnung</w:t>
+              <w:t>Dokumentenbezeichnung</w:t>
             </w:r>
           </w:p>
         </w:tc>
         <w:tc>
           <w:tcPr>
-            <w:shd w:fill="auto" w:val="clear"/>
+            <w:tcW w:w="4514" w:type="dxa"/>
+            <w:shd w:val="clear" w:color="auto" w:fill="auto"/>
             <w:tcMar>
-              <w:top w:w="100.0" w:type="dxa"/>
-              <w:left w:w="100.0" w:type="dxa"/>
-              <w:bottom w:w="100.0" w:type="dxa"/>
-              <w:right w:w="100.0" w:type="dxa"/>
+              <w:top w:w="100" w:type="dxa"/>
+              <w:left w:w="100" w:type="dxa"/>
+              <w:bottom w:w="100" w:type="dxa"/>
+              <w:right w:w="100" w:type="dxa"/>
             </w:tcMar>
-            <w:vAlign w:val="top"/>
           </w:tcPr>
           <w:p>
             <w:pPr>
               <w:widowControl w:val="0"/>
               <w:spacing w:line="240" w:lineRule="auto"/>
-              <w:rPr/>
             </w:pPr>
             <w:r>
-              <w:rPr>
-                <w:rtl w:val="0"/>
-              </w:rPr>
-              <w:t xml:space="preserve">Post Mortem Analyse.docx</w:t>
+              <w:t>Post Mortem Analyse.docx</w:t>
             </w:r>
           </w:p>
         </w:tc>
       </w:tr>
     </w:tbl>
-    <w:p>
-      <w:pPr>
-        <w:rPr/>
-      </w:pPr>
-      <w:r>
-        <w:rPr>
-          <w:rtl w:val="0"/>
-        </w:rPr>
-      </w:r>
-    </w:p>
-    <w:p>
-      <w:pPr>
-        <w:pStyle w:val="Heading2"/>
-        <w:rPr/>
-      </w:pPr>
-      <w:bookmarkStart w:colFirst="0" w:colLast="0" w:name="_qk1b2p6iq7r8" w:id="1"/>
+    <w:p/>
+    <w:p>
+      <w:pPr>
+        <w:pStyle w:val="berschrift2"/>
+      </w:pPr>
+      <w:bookmarkStart w:id="1" w:name="_qk1b2p6iq7r8" w:colFirst="0" w:colLast="0"/>
       <w:bookmarkEnd w:id="1"/>
       <w:r>
-        <w:rPr>
-          <w:rtl w:val="0"/>
-        </w:rPr>
-        <w:t xml:space="preserve">Historie der Dokumentenversionen</w:t>
+        <w:t>Historie der Dokumentenversionen</w:t>
       </w:r>
     </w:p>
     <w:tbl>
       <w:tblPr>
-        <w:tblStyle w:val="Table2"/>
-        <w:tblW w:w="9000.0" w:type="dxa"/>
-        <w:jc w:val="left"/>
+        <w:tblStyle w:val="a0"/>
+        <w:tblW w:w="9000" w:type="dxa"/>
+        <w:tblInd w:w="0" w:type="dxa"/>
         <w:tblBorders>
-          <w:top w:color="000000" w:space="0" w:sz="8" w:val="single"/>
-          <w:left w:color="000000" w:space="0" w:sz="8" w:val="single"/>
-          <w:bottom w:color="000000" w:space="0" w:sz="8" w:val="single"/>
-          <w:right w:color="000000" w:space="0" w:sz="8" w:val="single"/>
-          <w:insideH w:color="000000" w:space="0" w:sz="8" w:val="single"/>
-          <w:insideV w:color="000000" w:space="0" w:sz="8" w:val="single"/>
+          <w:top w:val="single" w:sz="8" w:space="0" w:color="000000"/>
+          <w:left w:val="single" w:sz="8" w:space="0" w:color="000000"/>
+          <w:bottom w:val="single" w:sz="8" w:space="0" w:color="000000"/>
+          <w:right w:val="single" w:sz="8" w:space="0" w:color="000000"/>
+          <w:insideH w:val="single" w:sz="8" w:space="0" w:color="000000"/>
+          <w:insideV w:val="single" w:sz="8" w:space="0" w:color="000000"/>
         </w:tblBorders>
         <w:tblLayout w:type="fixed"/>
-        <w:tblLook w:val="0600"/>
+        <w:tblLook w:val="0600" w:firstRow="0" w:lastRow="0" w:firstColumn="0" w:lastColumn="0" w:noHBand="1" w:noVBand="1"/>
       </w:tblPr>
       <w:tblGrid>
         <w:gridCol w:w="1455"/>
         <w:gridCol w:w="1695"/>
         <w:gridCol w:w="2100"/>
         <w:gridCol w:w="3750"/>
-        <w:tblGridChange w:id="0">
-          <w:tblGrid>
-            <w:gridCol w:w="1455"/>
-            <w:gridCol w:w="1695"/>
-            <w:gridCol w:w="2100"/>
-            <w:gridCol w:w="3750"/>
-          </w:tblGrid>
-        </w:tblGridChange>
       </w:tblGrid>
       <w:tr>
-        <w:trPr>
-          <w:cantSplit w:val="0"/>
-          <w:tblHeader w:val="0"/>
-        </w:trPr>
         <w:tc>
           <w:tcPr>
-            <w:shd w:fill="auto" w:val="clear"/>
+            <w:tcW w:w="1455" w:type="dxa"/>
+            <w:shd w:val="clear" w:color="auto" w:fill="auto"/>
             <w:tcMar>
-              <w:top w:w="100.0" w:type="dxa"/>
-              <w:left w:w="100.0" w:type="dxa"/>
-              <w:bottom w:w="100.0" w:type="dxa"/>
-              <w:right w:w="100.0" w:type="dxa"/>
+              <w:top w:w="100" w:type="dxa"/>
+              <w:left w:w="100" w:type="dxa"/>
+              <w:bottom w:w="100" w:type="dxa"/>
+              <w:right w:w="100" w:type="dxa"/>
             </w:tcMar>
-            <w:vAlign w:val="top"/>
           </w:tcPr>
           <w:p>
             <w:pPr>
               <w:widowControl w:val="0"/>
               <w:spacing w:line="240" w:lineRule="auto"/>
               <w:rPr>
-                <w:b w:val="1"/>
+                <w:b/>
               </w:rPr>
             </w:pPr>
             <w:r>
               <w:rPr>
-                <w:b w:val="1"/>
-                <w:rtl w:val="0"/>
+                <w:b/>
               </w:rPr>
-              <w:t xml:space="preserve">Version</w:t>
+              <w:t>Version</w:t>
             </w:r>
           </w:p>
         </w:tc>
         <w:tc>
           <w:tcPr>
-            <w:shd w:fill="auto" w:val="clear"/>
+            <w:tcW w:w="1695" w:type="dxa"/>
+            <w:shd w:val="clear" w:color="auto" w:fill="auto"/>
             <w:tcMar>
-              <w:top w:w="100.0" w:type="dxa"/>
-              <w:left w:w="100.0" w:type="dxa"/>
-              <w:bottom w:w="100.0" w:type="dxa"/>
-              <w:right w:w="100.0" w:type="dxa"/>
+              <w:top w:w="100" w:type="dxa"/>
+              <w:left w:w="100" w:type="dxa"/>
+              <w:bottom w:w="100" w:type="dxa"/>
+              <w:right w:w="100" w:type="dxa"/>
             </w:tcMar>
-            <w:vAlign w:val="top"/>
           </w:tcPr>
           <w:p>
             <w:pPr>
               <w:widowControl w:val="0"/>
               <w:spacing w:line="240" w:lineRule="auto"/>
               <w:rPr>
-                <w:b w:val="1"/>
+                <w:b/>
               </w:rPr>
             </w:pPr>
             <w:r>
               <w:rPr>
-                <w:b w:val="1"/>
-                <w:rtl w:val="0"/>
+                <w:b/>
               </w:rPr>
-              <w:t xml:space="preserve">Datum</w:t>
+              <w:t>Datum</w:t>
             </w:r>
           </w:p>
         </w:tc>
         <w:tc>
           <w:tcPr>
-            <w:shd w:fill="auto" w:val="clear"/>
+            <w:tcW w:w="2100" w:type="dxa"/>
+            <w:shd w:val="clear" w:color="auto" w:fill="auto"/>
             <w:tcMar>
-              <w:top w:w="100.0" w:type="dxa"/>
-              <w:left w:w="100.0" w:type="dxa"/>
-              <w:bottom w:w="100.0" w:type="dxa"/>
-              <w:right w:w="100.0" w:type="dxa"/>
+              <w:top w:w="100" w:type="dxa"/>
+              <w:left w:w="100" w:type="dxa"/>
+              <w:bottom w:w="100" w:type="dxa"/>
+              <w:right w:w="100" w:type="dxa"/>
             </w:tcMar>
-            <w:vAlign w:val="top"/>
           </w:tcPr>
           <w:p>
             <w:pPr>
               <w:widowControl w:val="0"/>
               <w:spacing w:line="240" w:lineRule="auto"/>
               <w:rPr>
-                <w:b w:val="1"/>
+                <w:b/>
               </w:rPr>
             </w:pPr>
             <w:r>
               <w:rPr>
-                <w:b w:val="1"/>
-                <w:rtl w:val="0"/>
+                <w:b/>
               </w:rPr>
-              <w:t xml:space="preserve">Autor</w:t>
+              <w:t>Autor</w:t>
             </w:r>
           </w:p>
         </w:tc>
         <w:tc>
           <w:tcPr>
-            <w:shd w:fill="auto" w:val="clear"/>
+            <w:tcW w:w="3750" w:type="dxa"/>
+            <w:shd w:val="clear" w:color="auto" w:fill="auto"/>
             <w:tcMar>
-              <w:top w:w="100.0" w:type="dxa"/>
-              <w:left w:w="100.0" w:type="dxa"/>
-              <w:bottom w:w="100.0" w:type="dxa"/>
-              <w:right w:w="100.0" w:type="dxa"/>
+              <w:top w:w="100" w:type="dxa"/>
+              <w:left w:w="100" w:type="dxa"/>
+              <w:bottom w:w="100" w:type="dxa"/>
+              <w:right w:w="100" w:type="dxa"/>
             </w:tcMar>
-            <w:vAlign w:val="top"/>
           </w:tcPr>
           <w:p>
             <w:pPr>
               <w:widowControl w:val="0"/>
               <w:spacing w:line="240" w:lineRule="auto"/>
               <w:rPr>
-                <w:b w:val="1"/>
+                <w:b/>
               </w:rPr>
             </w:pPr>
             <w:r>
               <w:rPr>
-                <w:b w:val="1"/>
-                <w:rtl w:val="0"/>
+                <w:b/>
               </w:rPr>
-              <w:t xml:space="preserve">Anmerkungen/Bemerkungen</w:t>
+              <w:t>Anmerkungen/Bemerkungen</w:t>
             </w:r>
           </w:p>
         </w:tc>
       </w:tr>
       <w:tr>
-        <w:trPr>
-          <w:cantSplit w:val="0"/>
-          <w:tblHeader w:val="0"/>
-        </w:trPr>
         <w:tc>
           <w:tcPr>
-            <w:shd w:fill="auto" w:val="clear"/>
+            <w:tcW w:w="1455" w:type="dxa"/>
+            <w:shd w:val="clear" w:color="auto" w:fill="auto"/>
             <w:tcMar>
-              <w:top w:w="100.0" w:type="dxa"/>
-              <w:left w:w="100.0" w:type="dxa"/>
-              <w:bottom w:w="100.0" w:type="dxa"/>
-              <w:right w:w="100.0" w:type="dxa"/>
+              <w:top w:w="100" w:type="dxa"/>
+              <w:left w:w="100" w:type="dxa"/>
+              <w:bottom w:w="100" w:type="dxa"/>
+              <w:right w:w="100" w:type="dxa"/>
             </w:tcMar>
-            <w:vAlign w:val="top"/>
           </w:tcPr>
           <w:p>
             <w:pPr>
               <w:widowControl w:val="0"/>
               <w:spacing w:line="240" w:lineRule="auto"/>
-              <w:rPr/>
             </w:pPr>
             <w:r>
-              <w:rPr>
-                <w:rtl w:val="0"/>
-              </w:rPr>
-              <w:t xml:space="preserve">0.1</w:t>
+              <w:t>0.1</w:t>
             </w:r>
           </w:p>
         </w:tc>
         <w:tc>
           <w:tcPr>
-            <w:shd w:fill="auto" w:val="clear"/>
+            <w:tcW w:w="1695" w:type="dxa"/>
+            <w:shd w:val="clear" w:color="auto" w:fill="auto"/>
             <w:tcMar>
-              <w:top w:w="100.0" w:type="dxa"/>
-              <w:left w:w="100.0" w:type="dxa"/>
-              <w:bottom w:w="100.0" w:type="dxa"/>
-              <w:right w:w="100.0" w:type="dxa"/>
+              <w:top w:w="100" w:type="dxa"/>
+              <w:left w:w="100" w:type="dxa"/>
+              <w:bottom w:w="100" w:type="dxa"/>
+              <w:right w:w="100" w:type="dxa"/>
             </w:tcMar>
-            <w:vAlign w:val="top"/>
           </w:tcPr>
           <w:p>
             <w:pPr>
               <w:widowControl w:val="0"/>
               <w:spacing w:line="240" w:lineRule="auto"/>
-              <w:rPr/>
             </w:pPr>
             <w:r>
-              <w:rPr>
-                <w:rtl w:val="0"/>
-              </w:rPr>
-              <w:t xml:space="preserve">26.06.2025</w:t>
+              <w:t>26.06.2025</w:t>
             </w:r>
           </w:p>
         </w:tc>
         <w:tc>
           <w:tcPr>
-            <w:shd w:fill="auto" w:val="clear"/>
+            <w:tcW w:w="2100" w:type="dxa"/>
+            <w:shd w:val="clear" w:color="auto" w:fill="auto"/>
             <w:tcMar>
-              <w:top w:w="100.0" w:type="dxa"/>
-              <w:left w:w="100.0" w:type="dxa"/>
-              <w:bottom w:w="100.0" w:type="dxa"/>
-              <w:right w:w="100.0" w:type="dxa"/>
+              <w:top w:w="100" w:type="dxa"/>
+              <w:left w:w="100" w:type="dxa"/>
+              <w:bottom w:w="100" w:type="dxa"/>
+              <w:right w:w="100" w:type="dxa"/>
             </w:tcMar>
-            <w:vAlign w:val="top"/>
           </w:tcPr>
           <w:p>
             <w:pPr>
               <w:widowControl w:val="0"/>
               <w:spacing w:line="240" w:lineRule="auto"/>
-              <w:rPr/>
             </w:pPr>
             <w:r>
-              <w:rPr>
-                <w:rtl w:val="0"/>
-              </w:rPr>
-              <w:t xml:space="preserve">Jan Benz</w:t>
+              <w:t>Jan Benz</w:t>
             </w:r>
           </w:p>
         </w:tc>
         <w:tc>
           <w:tcPr>
-            <w:shd w:fill="auto" w:val="clear"/>
+            <w:tcW w:w="3750" w:type="dxa"/>
+            <w:shd w:val="clear" w:color="auto" w:fill="auto"/>
             <w:tcMar>
-              <w:top w:w="100.0" w:type="dxa"/>
-              <w:left w:w="100.0" w:type="dxa"/>
-              <w:bottom w:w="100.0" w:type="dxa"/>
-              <w:right w:w="100.0" w:type="dxa"/>
+              <w:top w:w="100" w:type="dxa"/>
+              <w:left w:w="100" w:type="dxa"/>
+              <w:bottom w:w="100" w:type="dxa"/>
+              <w:right w:w="100" w:type="dxa"/>
             </w:tcMar>
-            <w:vAlign w:val="top"/>
           </w:tcPr>
           <w:p>
             <w:pPr>
               <w:widowControl w:val="0"/>
               <w:spacing w:line="240" w:lineRule="auto"/>
-              <w:rPr/>
             </w:pPr>
             <w:r>
-              <w:rPr>
-                <w:rtl w:val="0"/>
-              </w:rPr>
-              <w:t xml:space="preserve">Ersterstellung</w:t>
+              <w:t>Ersterstellung</w:t>
             </w:r>
           </w:p>
         </w:tc>
@@ -716,120 +579,93 @@
     </w:tbl>
     <w:p>
       <w:pPr>
-        <w:pStyle w:val="Heading2"/>
-        <w:rPr/>
-      </w:pPr>
-      <w:bookmarkStart w:colFirst="0" w:colLast="0" w:name="_kn7lpktytxrd" w:id="2"/>
+        <w:pStyle w:val="berschrift2"/>
+      </w:pPr>
+      <w:bookmarkStart w:id="2" w:name="_kn7lpktytxrd" w:colFirst="0" w:colLast="0"/>
       <w:bookmarkEnd w:id="2"/>
       <w:r>
+        <w:br/>
+        <w:t>Projekt</w:t>
+      </w:r>
+    </w:p>
+    <w:p>
+      <w:r>
         <w:rPr>
-          <w:rtl w:val="0"/>
+          <w:b/>
         </w:rPr>
-        <w:br w:type="textWrapping"/>
-        <w:t xml:space="preserve">Projekt</w:t>
-      </w:r>
-    </w:p>
-    <w:p>
-      <w:pPr>
-        <w:rPr/>
-      </w:pPr>
+        <w:t>Projektzeitraum</w:t>
+      </w:r>
+      <w:r>
+        <w:t xml:space="preserve"> </w:t>
+      </w:r>
+      <w:r>
+        <w:tab/>
+        <w:t>21.03.2025 - 27.06.2025</w:t>
+      </w:r>
+    </w:p>
+    <w:p>
       <w:r>
         <w:rPr>
-          <w:b w:val="1"/>
-          <w:rtl w:val="0"/>
+          <w:b/>
         </w:rPr>
-        <w:t xml:space="preserve">Projektzeitraum</w:t>
-      </w:r>
+        <w:t>Projektteam</w:t>
+      </w:r>
+      <w:r>
+        <w:t xml:space="preserve"> </w:t>
+      </w:r>
+      <w:r>
+        <w:tab/>
+      </w:r>
+      <w:r>
+        <w:tab/>
+        <w:t>Team Rocket</w:t>
+      </w:r>
+    </w:p>
+    <w:p>
       <w:r>
         <w:rPr>
-          <w:rtl w:val="0"/>
+          <w:b/>
         </w:rPr>
-        <w:t xml:space="preserve"> </w:t>
+        <w:t>Ziel</w:t>
+      </w:r>
+      <w:r>
         <w:tab/>
-        <w:t xml:space="preserve">21.03.2025 - 27.06.2025</w:t>
-      </w:r>
-    </w:p>
-    <w:p>
-      <w:pPr>
-        <w:rPr/>
-      </w:pPr>
-      <w:r>
-        <w:rPr>
-          <w:b w:val="1"/>
-          <w:rtl w:val="0"/>
-        </w:rPr>
-        <w:t xml:space="preserve">Projektteam</w:t>
-      </w:r>
-      <w:r>
-        <w:rPr>
-          <w:rtl w:val="0"/>
-        </w:rPr>
-        <w:t xml:space="preserve"> </w:t>
+      </w:r>
+      <w:r>
         <w:tab/>
-        <w:tab/>
-        <w:t xml:space="preserve">Team Rocket</w:t>
-      </w:r>
-    </w:p>
-    <w:p>
-      <w:pPr>
-        <w:rPr/>
-      </w:pPr>
-      <w:r>
-        <w:rPr>
-          <w:b w:val="1"/>
-          <w:rtl w:val="0"/>
-        </w:rPr>
-        <w:t xml:space="preserve">Ziel</w:t>
-      </w:r>
-      <w:r>
-        <w:rPr>
-          <w:rtl w:val="0"/>
-        </w:rPr>
-        <w:tab/>
-        <w:tab/>
+      </w:r>
+      <w:r>
         <w:tab/>
         <w:t xml:space="preserve">Sprachgesteuerte Spritzgussmaschine </w:t>
       </w:r>
     </w:p>
     <w:p>
       <w:pPr>
-        <w:pStyle w:val="Heading2"/>
-        <w:rPr/>
-      </w:pPr>
-      <w:bookmarkStart w:colFirst="0" w:colLast="0" w:name="_j6gpswxzb4qg" w:id="3"/>
+        <w:pStyle w:val="berschrift2"/>
+      </w:pPr>
+      <w:bookmarkStart w:id="3" w:name="_j6gpswxzb4qg" w:colFirst="0" w:colLast="0"/>
       <w:bookmarkEnd w:id="3"/>
       <w:r>
-        <w:rPr>
-          <w:rtl w:val="0"/>
-        </w:rPr>
-        <w:br w:type="textWrapping"/>
-        <w:t xml:space="preserve">Ergebnis</w:t>
-      </w:r>
-    </w:p>
-    <w:p>
-      <w:pPr>
-        <w:rPr/>
-      </w:pPr>
-      <w:r>
-        <w:rPr>
-          <w:rtl w:val="0"/>
-        </w:rPr>
-        <w:t xml:space="preserve">Das Projekt wurde rechtzeitig abgeschlossen. Im praktischen Einsatz zeigten sich jedoch Schwächen bei der Genauigkeit der Spracherkennung, insbesondere bei der Erkennung bestimmter Zahlen.</w:t>
-        <w:br w:type="textWrapping"/>
-      </w:r>
-    </w:p>
-    <w:p>
-      <w:pPr>
-        <w:pStyle w:val="Heading2"/>
-        <w:rPr/>
-      </w:pPr>
-      <w:bookmarkStart w:colFirst="0" w:colLast="0" w:name="_drdqkuf5wt1h" w:id="4"/>
+        <w:br/>
+        <w:t>Ergebnis</w:t>
+      </w:r>
+    </w:p>
+    <w:p>
+      <w:r>
+        <w:t>Das Projekt wurde rechtzeitig abgeschlossen. Im praktischen Einsatz zeigten sich jedoch Schwächen bei der Genauigkeit der Spracherkennung, insbesondere bei der Erkennung bestimmter Zahlen.</w:t>
+      </w:r>
+      <w:r>
+        <w:br/>
+      </w:r>
+    </w:p>
+    <w:p>
+      <w:pPr>
+        <w:pStyle w:val="berschrift2"/>
+      </w:pPr>
+      <w:bookmarkStart w:id="4" w:name="_drdqkuf5wt1h" w:colFirst="0" w:colLast="0"/>
       <w:bookmarkEnd w:id="4"/>
       <w:r>
-        <w:rPr>
-          <w:rtl w:val="0"/>
-        </w:rPr>
-        <w:t xml:space="preserve">Was lief gut?</w:t>
+        <w:t>Was lief gut?</w:t>
       </w:r>
     </w:p>
     <w:p>
@@ -838,16 +674,9 @@
           <w:ilvl w:val="0"/>
           <w:numId w:val="3"/>
         </w:numPr>
-        <w:ind w:left="720" w:hanging="360"/>
-        <w:rPr>
-          <w:u w:val="none"/>
-        </w:rPr>
-      </w:pPr>
-      <w:r>
-        <w:rPr>
-          <w:rtl w:val="0"/>
-        </w:rPr>
-        <w:t xml:space="preserve">Die grundlegende Integration von MFCC zur Sprachanalyse konnte erfolgreich umgesetzt werden</w:t>
+      </w:pPr>
+      <w:r>
+        <w:t>Die grundlegende Integration von MFCC zur Sprachanalyse konnte erfolgreich umgesetzt werden</w:t>
       </w:r>
     </w:p>
     <w:p>
@@ -856,16 +685,9 @@
           <w:ilvl w:val="0"/>
           <w:numId w:val="3"/>
         </w:numPr>
-        <w:ind w:left="720" w:hanging="360"/>
-        <w:rPr>
-          <w:u w:val="none"/>
-        </w:rPr>
-      </w:pPr>
-      <w:r>
-        <w:rPr>
-          <w:rtl w:val="0"/>
-        </w:rPr>
-        <w:t xml:space="preserve">Gute Aufgabenteilung und Kommunikation des Teams</w:t>
+      </w:pPr>
+      <w:r>
+        <w:t>Gute Aufgabenteilung und Kommunikation des Teams</w:t>
       </w:r>
     </w:p>
     <w:p>
@@ -874,41 +696,21 @@
           <w:ilvl w:val="0"/>
           <w:numId w:val="3"/>
         </w:numPr>
-        <w:ind w:left="720" w:hanging="360"/>
-        <w:rPr>
-          <w:u w:val="none"/>
-        </w:rPr>
-      </w:pPr>
-      <w:r>
-        <w:rPr>
-          <w:rtl w:val="0"/>
-        </w:rPr>
-        <w:t xml:space="preserve">Projektpräsentation und Dokumentation waren vollständig und termingerecht</w:t>
-      </w:r>
-    </w:p>
-    <w:p>
-      <w:pPr>
-        <w:ind w:left="0" w:firstLine="0"/>
-        <w:rPr/>
-      </w:pPr>
-      <w:r>
-        <w:rPr>
-          <w:rtl w:val="0"/>
-        </w:rPr>
-      </w:r>
-    </w:p>
-    <w:p>
-      <w:pPr>
-        <w:pStyle w:val="Heading2"/>
-        <w:rPr/>
-      </w:pPr>
-      <w:bookmarkStart w:colFirst="0" w:colLast="0" w:name="_phqxp1l3b8b3" w:id="5"/>
+      </w:pPr>
+      <w:r>
+        <w:t>Projektpräsentation und Dokumentation waren vollständig und termingerecht</w:t>
+      </w:r>
+    </w:p>
+    <w:p/>
+    <w:p>
+      <w:pPr>
+        <w:pStyle w:val="berschrift2"/>
+      </w:pPr>
+      <w:bookmarkStart w:id="5" w:name="_phqxp1l3b8b3" w:colFirst="0" w:colLast="0"/>
       <w:bookmarkEnd w:id="5"/>
       <w:r>
-        <w:rPr>
-          <w:rtl w:val="0"/>
-        </w:rPr>
-        <w:t xml:space="preserve">Was lief schlecht?</w:t>
+        <w:lastRenderedPageBreak/>
+        <w:t>Was lief schlecht?</w:t>
       </w:r>
     </w:p>
     <w:p>
@@ -917,16 +719,9 @@
           <w:ilvl w:val="0"/>
           <w:numId w:val="1"/>
         </w:numPr>
-        <w:ind w:left="720" w:hanging="360"/>
-        <w:rPr>
-          <w:u w:val="none"/>
-        </w:rPr>
-      </w:pPr>
-      <w:r>
-        <w:rPr>
-          <w:rtl w:val="0"/>
-        </w:rPr>
-        <w:t xml:space="preserve">Die Spracherkennung, insbesondere bei bestimmten Zahlen, war fehleranfällig</w:t>
+      </w:pPr>
+      <w:r>
+        <w:t>Die Spracherkennung, insbesondere bei bestimmten Zahlen, war fehleranfällig</w:t>
       </w:r>
     </w:p>
     <w:p>
@@ -935,40 +730,31 @@
           <w:ilvl w:val="0"/>
           <w:numId w:val="1"/>
         </w:numPr>
-        <w:ind w:left="720" w:hanging="360"/>
-        <w:rPr>
-          <w:u w:val="none"/>
-        </w:rPr>
-      </w:pPr>
-      <w:r>
-        <w:rPr>
-          <w:rtl w:val="0"/>
-        </w:rPr>
-        <w:t xml:space="preserve">Relativ große Verzögerung, bis ein Sprachbefehl angezeigt wird</w:t>
-      </w:r>
-    </w:p>
-    <w:p>
-      <w:pPr>
-        <w:rPr/>
-      </w:pPr>
-      <w:r>
-        <w:rPr>
-          <w:rtl w:val="0"/>
-        </w:rPr>
-      </w:r>
-    </w:p>
-    <w:p>
-      <w:pPr>
-        <w:pStyle w:val="Heading2"/>
-        <w:rPr/>
-      </w:pPr>
-      <w:bookmarkStart w:colFirst="0" w:colLast="0" w:name="_qpn32rsfn64x" w:id="6"/>
+      </w:pPr>
+      <w:r>
+        <w:t>Relativ große Verzögerung, bis ein Sprachbefehl angezeigt wird</w:t>
+      </w:r>
+    </w:p>
+    <w:p>
+      <w:pPr>
+        <w:numPr>
+          <w:ilvl w:val="0"/>
+          <w:numId w:val="1"/>
+        </w:numPr>
+      </w:pPr>
+      <w:r>
+        <w:t>Erstellung der Dokumente</w:t>
+      </w:r>
+    </w:p>
+    <w:p/>
+    <w:p>
+      <w:pPr>
+        <w:pStyle w:val="berschrift2"/>
+      </w:pPr>
+      <w:bookmarkStart w:id="6" w:name="_qpn32rsfn64x" w:colFirst="0" w:colLast="0"/>
       <w:bookmarkEnd w:id="6"/>
       <w:r>
-        <w:rPr>
-          <w:rtl w:val="0"/>
-        </w:rPr>
-        <w:t xml:space="preserve">Ursachenanalyse</w:t>
+        <w:t>Ursachenanalyse</w:t>
       </w:r>
     </w:p>
     <w:p>
@@ -977,16 +763,9 @@
           <w:ilvl w:val="0"/>
           <w:numId w:val="4"/>
         </w:numPr>
-        <w:ind w:left="720" w:hanging="360"/>
-        <w:rPr>
-          <w:u w:val="none"/>
-        </w:rPr>
-      </w:pPr>
-      <w:r>
-        <w:rPr>
-          <w:rtl w:val="0"/>
-        </w:rPr>
-        <w:t xml:space="preserve">Zu wenig Erfahrung mit Spracherkennungsalgorithmen</w:t>
+      </w:pPr>
+      <w:r>
+        <w:t>Zu wenig Erfahrung mit Spracherkennungsalgorithmen</w:t>
       </w:r>
     </w:p>
     <w:p>
@@ -995,16 +774,9 @@
           <w:ilvl w:val="0"/>
           <w:numId w:val="4"/>
         </w:numPr>
-        <w:ind w:left="720" w:hanging="360"/>
-        <w:rPr>
-          <w:u w:val="none"/>
-        </w:rPr>
-      </w:pPr>
-      <w:r>
-        <w:rPr>
-          <w:rtl w:val="0"/>
-        </w:rPr>
-        <w:t xml:space="preserve">Zu wenig Testdaten</w:t>
+      </w:pPr>
+      <w:r>
+        <w:t>Zu wenig Testdaten</w:t>
       </w:r>
     </w:p>
     <w:p>
@@ -1013,40 +785,31 @@
           <w:ilvl w:val="0"/>
           <w:numId w:val="4"/>
         </w:numPr>
-        <w:ind w:left="720" w:hanging="360"/>
-        <w:rPr>
-          <w:u w:val="none"/>
-        </w:rPr>
-      </w:pPr>
-      <w:r>
-        <w:rPr>
-          <w:rtl w:val="0"/>
-        </w:rPr>
-        <w:t xml:space="preserve">Zu wenig Zeit für die Spracherkennung eingeplant</w:t>
-      </w:r>
-    </w:p>
-    <w:p>
-      <w:pPr>
-        <w:rPr/>
-      </w:pPr>
-      <w:r>
-        <w:rPr>
-          <w:rtl w:val="0"/>
-        </w:rPr>
-      </w:r>
-    </w:p>
-    <w:p>
-      <w:pPr>
-        <w:pStyle w:val="Heading2"/>
-        <w:rPr/>
-      </w:pPr>
-      <w:bookmarkStart w:colFirst="0" w:colLast="0" w:name="_w71dyn2b9qty" w:id="7"/>
+      </w:pPr>
+      <w:r>
+        <w:t>Zu wenig Zeit für die Spracherkennung eingeplant</w:t>
+      </w:r>
+    </w:p>
+    <w:p>
+      <w:pPr>
+        <w:numPr>
+          <w:ilvl w:val="0"/>
+          <w:numId w:val="4"/>
+        </w:numPr>
+      </w:pPr>
+      <w:r>
+        <w:t>Keine Vorlagen und/oder Spezifikationen über maßgebende Kriterien</w:t>
+      </w:r>
+    </w:p>
+    <w:p/>
+    <w:p>
+      <w:pPr>
+        <w:pStyle w:val="berschrift2"/>
+      </w:pPr>
+      <w:bookmarkStart w:id="7" w:name="_w71dyn2b9qty" w:colFirst="0" w:colLast="0"/>
       <w:bookmarkEnd w:id="7"/>
       <w:r>
-        <w:rPr>
-          <w:rtl w:val="0"/>
-        </w:rPr>
-        <w:t xml:space="preserve">Empfohlene Maßnahmen</w:t>
+        <w:t>Empfohlene Maßnahmen</w:t>
       </w:r>
     </w:p>
     <w:p>
@@ -1055,16 +818,9 @@
           <w:ilvl w:val="0"/>
           <w:numId w:val="5"/>
         </w:numPr>
-        <w:ind w:left="720" w:hanging="360"/>
-        <w:rPr>
-          <w:u w:val="none"/>
-        </w:rPr>
-      </w:pPr>
-      <w:r>
-        <w:rPr>
-          <w:rtl w:val="0"/>
-        </w:rPr>
-        <w:t xml:space="preserve">Integration einer ML-basierten Spracherkennung</w:t>
+      </w:pPr>
+      <w:r>
+        <w:t>Integration einer ML-basierten Spracherkennung</w:t>
       </w:r>
     </w:p>
     <w:p>
@@ -1073,40 +829,31 @@
           <w:ilvl w:val="0"/>
           <w:numId w:val="5"/>
         </w:numPr>
-        <w:ind w:left="720" w:hanging="360"/>
-        <w:rPr>
-          <w:u w:val="none"/>
-        </w:rPr>
-      </w:pPr>
-      <w:r>
-        <w:rPr>
-          <w:rtl w:val="0"/>
-        </w:rPr>
-        <w:t xml:space="preserve">Mehr Testdaten mit mehreren Sprechern und unterschiedlichen Umgebungsbedingungen</w:t>
-      </w:r>
-    </w:p>
-    <w:p>
-      <w:pPr>
-        <w:rPr/>
-      </w:pPr>
-      <w:r>
-        <w:rPr>
-          <w:rtl w:val="0"/>
-        </w:rPr>
-      </w:r>
-    </w:p>
-    <w:p>
-      <w:pPr>
-        <w:pStyle w:val="Heading2"/>
-        <w:rPr/>
-      </w:pPr>
-      <w:bookmarkStart w:colFirst="0" w:colLast="0" w:name="_voem2al2gnpr" w:id="8"/>
+      </w:pPr>
+      <w:r>
+        <w:t>Mehr Testdaten mit mehreren Sprechern und unterschiedlichen Umgebungsbedingungen</w:t>
+      </w:r>
+    </w:p>
+    <w:p>
+      <w:pPr>
+        <w:numPr>
+          <w:ilvl w:val="0"/>
+          <w:numId w:val="5"/>
+        </w:numPr>
+      </w:pPr>
+      <w:r>
+        <w:t>Mehr Vorlagen und evtl. gemeinsame Erstellung der Dokumente mit Experten (z.B. Dozenten)</w:t>
+      </w:r>
+    </w:p>
+    <w:p/>
+    <w:p>
+      <w:pPr>
+        <w:pStyle w:val="berschrift2"/>
+      </w:pPr>
+      <w:bookmarkStart w:id="8" w:name="_voem2al2gnpr" w:colFirst="0" w:colLast="0"/>
       <w:bookmarkEnd w:id="8"/>
       <w:r>
-        <w:rPr>
-          <w:rtl w:val="0"/>
-        </w:rPr>
-        <w:t xml:space="preserve">Lernpunkte</w:t>
+        <w:t>Lernpunkte</w:t>
       </w:r>
     </w:p>
     <w:p>
@@ -1115,16 +862,9 @@
           <w:ilvl w:val="0"/>
           <w:numId w:val="2"/>
         </w:numPr>
-        <w:ind w:left="720" w:hanging="360"/>
-        <w:rPr>
-          <w:u w:val="none"/>
-        </w:rPr>
-      </w:pPr>
-      <w:r>
-        <w:rPr>
-          <w:rtl w:val="0"/>
-        </w:rPr>
-        <w:t xml:space="preserve">Anspruchsvolle, aber lösbare technische Integration</w:t>
+      </w:pPr>
+      <w:r>
+        <w:t>Anspruchsvolle, aber lösbare technische Integration</w:t>
       </w:r>
     </w:p>
     <w:p>
@@ -1133,16 +873,9 @@
           <w:ilvl w:val="0"/>
           <w:numId w:val="2"/>
         </w:numPr>
-        <w:ind w:left="720" w:hanging="360"/>
-        <w:rPr>
-          <w:u w:val="none"/>
-        </w:rPr>
-      </w:pPr>
-      <w:r>
-        <w:rPr>
-          <w:rtl w:val="0"/>
-        </w:rPr>
-        <w:t xml:space="preserve">FFT allein ist durch eine hohe Fehleranfälligkeit unzuverlässig</w:t>
+      </w:pPr>
+      <w:r>
+        <w:t>FFT allein ist durch eine hohe Fehleranfälligkeit unzuverlässig</w:t>
       </w:r>
     </w:p>
     <w:p>
@@ -1151,15 +884,8 @@
           <w:ilvl w:val="0"/>
           <w:numId w:val="2"/>
         </w:numPr>
-        <w:ind w:left="720" w:hanging="360"/>
-        <w:rPr>
-          <w:u w:val="none"/>
-        </w:rPr>
-      </w:pPr>
-      <w:r>
-        <w:rPr>
-          <w:rtl w:val="0"/>
-        </w:rPr>
+      </w:pPr>
+      <w:r>
         <w:t xml:space="preserve">Mehr Zeit für die Programmierung der Spracherkennung einplanen </w:t>
       </w:r>
     </w:p>
@@ -1169,30 +895,74 @@
           <w:ilvl w:val="0"/>
           <w:numId w:val="2"/>
         </w:numPr>
-        <w:ind w:left="720" w:hanging="360"/>
-        <w:rPr>
-          <w:u w:val="none"/>
-        </w:rPr>
-      </w:pPr>
-      <w:r>
-        <w:rPr>
-          <w:rtl w:val="0"/>
-        </w:rPr>
-        <w:t xml:space="preserve">Gute Teamarbeit ist wichtig</w:t>
+      </w:pPr>
+      <w:r>
+        <w:t>Gute Teamarbeit ist wichtig</w:t>
       </w:r>
     </w:p>
     <w:sectPr>
-      <w:headerReference r:id="rId6" w:type="default"/>
-      <w:pgSz w:h="16834" w:w="11909" w:orient="portrait"/>
-      <w:pgMar w:bottom="1440" w:top="1440" w:left="1440" w:right="1440" w:header="720" w:footer="720"/>
+      <w:headerReference w:type="default" r:id="rId7"/>
+      <w:pgSz w:w="11909" w:h="16834"/>
+      <w:pgMar w:top="1440" w:right="1440" w:bottom="1440" w:left="1440" w:header="720" w:footer="720" w:gutter="0"/>
       <w:pgNumType w:start="1"/>
+      <w:cols w:space="720"/>
     </w:sectPr>
   </w:body>
 </w:document>
 </file>
 
+<file path=word/endnotes.xml><?xml version="1.0" encoding="utf-8"?>
+<w:endnotes xmlns:wpc="http://schemas.microsoft.com/office/word/2010/wordprocessingCanvas" xmlns:cx="http://schemas.microsoft.com/office/drawing/2014/chartex" xmlns:cx1="http://schemas.microsoft.com/office/drawing/2015/9/8/chartex" xmlns:cx2="http://schemas.microsoft.com/office/drawing/2015/10/21/chartex" xmlns:cx3="http://schemas.microsoft.com/office/drawing/2016/5/9/chartex" xmlns:cx4="http://schemas.microsoft.com/office/drawing/2016/5/10/chartex" xmlns:cx5="http://schemas.microsoft.com/office/drawing/2016/5/11/chartex" xmlns:cx6="http://schemas.microsoft.com/office/drawing/2016/5/12/chartex" xmlns:cx7="http://schemas.microsoft.com/office/drawing/2016/5/13/chartex" xmlns:cx8="http://schemas.microsoft.com/office/drawing/2016/5/14/chartex" xmlns:mc="http://schemas.openxmlformats.org/markup-compatibility/2006" xmlns:aink="http://schemas.microsoft.com/office/drawing/2016/ink" xmlns:am3d="http://schemas.microsoft.com/office/drawing/2017/model3d" xmlns:o="urn:schemas-microsoft-com:office:office" xmlns:oel="http://schemas.microsoft.com/office/2019/extlst" xmlns:r="http://schemas.openxmlformats.org/officeDocument/2006/relationships" xmlns:m="http://schemas.openxmlformats.org/officeDocument/2006/math" xmlns:v="urn:schemas-microsoft-com:vml" xmlns:wp14="http://schemas.microsoft.com/office/word/2010/wordprocessingDrawing" xmlns:wp="http://schemas.openxmlformats.org/drawingml/2006/wordprocessingDrawing" xmlns:w10="urn:schemas-microsoft-com:office:word" xmlns:w="http://schemas.openxmlformats.org/wordprocessingml/2006/main" xmlns:w14="http://schemas.microsoft.com/office/word/2010/wordml" xmlns:w15="http://schemas.microsoft.com/office/word/2012/wordml" xmlns:w16cex="http://schemas.microsoft.com/office/word/2018/wordml/cex" xmlns:w16cid="http://schemas.microsoft.com/office/word/2016/wordml/cid" xmlns:w16="http://schemas.microsoft.com/office/word/2018/wordml" xmlns:w16du="http://schemas.microsoft.com/office/word/2023/wordml/word16du" xmlns:w16sdtdh="http://schemas.microsoft.com/office/word/2020/wordml/sdtdatahash" xmlns:w16sdtfl="http://schemas.microsoft.com/office/word/2024/wordml/sdtformatlock" xmlns:w16se="http://schemas.microsoft.com/office/word/2015/wordml/symex" xmlns:wpg="http://schemas.microsoft.com/office/word/2010/wordprocessingGroup" xmlns:wpi="http://schemas.microsoft.com/office/word/2010/wordprocessingInk" xmlns:wne="http://schemas.microsoft.com/office/word/2006/wordml" xmlns:wps="http://schemas.microsoft.com/office/word/2010/wordprocessingShape" mc:Ignorable="w14 w15 w16se w16cid w16 w16cex w16sdtdh w16sdtfl w16du wp14">
+  <w:endnote w:type="separator" w:id="-1">
+    <w:p>
+      <w:pPr>
+        <w:spacing w:line="240" w:lineRule="auto"/>
+      </w:pPr>
+      <w:r>
+        <w:separator/>
+      </w:r>
+    </w:p>
+  </w:endnote>
+  <w:endnote w:type="continuationSeparator" w:id="0">
+    <w:p>
+      <w:pPr>
+        <w:spacing w:line="240" w:lineRule="auto"/>
+      </w:pPr>
+      <w:r>
+        <w:continuationSeparator/>
+      </w:r>
+    </w:p>
+  </w:endnote>
+</w:endnotes>
+</file>
+
+<file path=word/footnotes.xml><?xml version="1.0" encoding="utf-8"?>
+<w:footnotes xmlns:wpc="http://schemas.microsoft.com/office/word/2010/wordprocessingCanvas" xmlns:cx="http://schemas.microsoft.com/office/drawing/2014/chartex" xmlns:cx1="http://schemas.microsoft.com/office/drawing/2015/9/8/chartex" xmlns:cx2="http://schemas.microsoft.com/office/drawing/2015/10/21/chartex" xmlns:cx3="http://schemas.microsoft.com/office/drawing/2016/5/9/chartex" xmlns:cx4="http://schemas.microsoft.com/office/drawing/2016/5/10/chartex" xmlns:cx5="http://schemas.microsoft.com/office/drawing/2016/5/11/chartex" xmlns:cx6="http://schemas.microsoft.com/office/drawing/2016/5/12/chartex" xmlns:cx7="http://schemas.microsoft.com/office/drawing/2016/5/13/chartex" xmlns:cx8="http://schemas.microsoft.com/office/drawing/2016/5/14/chartex" xmlns:mc="http://schemas.openxmlformats.org/markup-compatibility/2006" xmlns:aink="http://schemas.microsoft.com/office/drawing/2016/ink" xmlns:am3d="http://schemas.microsoft.com/office/drawing/2017/model3d" xmlns:o="urn:schemas-microsoft-com:office:office" xmlns:oel="http://schemas.microsoft.com/office/2019/extlst" xmlns:r="http://schemas.openxmlformats.org/officeDocument/2006/relationships" xmlns:m="http://schemas.openxmlformats.org/officeDocument/2006/math" xmlns:v="urn:schemas-microsoft-com:vml" xmlns:wp14="http://schemas.microsoft.com/office/word/2010/wordprocessingDrawing" xmlns:wp="http://schemas.openxmlformats.org/drawingml/2006/wordprocessingDrawing" xmlns:w10="urn:schemas-microsoft-com:office:word" xmlns:w="http://schemas.openxmlformats.org/wordprocessingml/2006/main" xmlns:w14="http://schemas.microsoft.com/office/word/2010/wordml" xmlns:w15="http://schemas.microsoft.com/office/word/2012/wordml" xmlns:w16cex="http://schemas.microsoft.com/office/word/2018/wordml/cex" xmlns:w16cid="http://schemas.microsoft.com/office/word/2016/wordml/cid" xmlns:w16="http://schemas.microsoft.com/office/word/2018/wordml" xmlns:w16du="http://schemas.microsoft.com/office/word/2023/wordml/word16du" xmlns:w16sdtdh="http://schemas.microsoft.com/office/word/2020/wordml/sdtdatahash" xmlns:w16sdtfl="http://schemas.microsoft.com/office/word/2024/wordml/sdtformatlock" xmlns:w16se="http://schemas.microsoft.com/office/word/2015/wordml/symex" xmlns:wpg="http://schemas.microsoft.com/office/word/2010/wordprocessingGroup" xmlns:wpi="http://schemas.microsoft.com/office/word/2010/wordprocessingInk" xmlns:wne="http://schemas.microsoft.com/office/word/2006/wordml" xmlns:wps="http://schemas.microsoft.com/office/word/2010/wordprocessingShape" mc:Ignorable="w14 w15 w16se w16cid w16 w16cex w16sdtdh w16sdtfl w16du wp14">
+  <w:footnote w:type="separator" w:id="-1">
+    <w:p>
+      <w:pPr>
+        <w:spacing w:line="240" w:lineRule="auto"/>
+      </w:pPr>
+      <w:r>
+        <w:separator/>
+      </w:r>
+    </w:p>
+  </w:footnote>
+  <w:footnote w:type="continuationSeparator" w:id="0">
+    <w:p>
+      <w:pPr>
+        <w:spacing w:line="240" w:lineRule="auto"/>
+      </w:pPr>
+      <w:r>
+        <w:continuationSeparator/>
+      </w:r>
+    </w:p>
+  </w:footnote>
+</w:footnotes>
+</file>
+
 <file path=word/header1.xml><?xml version="1.0" encoding="utf-8"?>
-<w:hdr xmlns:mc="http://schemas.openxmlformats.org/markup-compatibility/2006" xmlns:o="urn:schemas-microsoft-com:office:office" xmlns:r="http://schemas.openxmlformats.org/officeDocument/2006/relationships" xmlns:m="http://schemas.openxmlformats.org/officeDocument/2006/math" xmlns:v="urn:schemas-microsoft-com:vml" xmlns:wp="http://schemas.openxmlformats.org/drawingml/2006/wordprocessingDrawing" xmlns:w10="urn:schemas-microsoft-com:office:word" xmlns:w="http://schemas.openxmlformats.org/wordprocessingml/2006/main" xmlns:wne="http://schemas.microsoft.com/office/word/2006/wordml" xmlns:sl="http://schemas.openxmlformats.org/schemaLibrary/2006/main" xmlns:a="http://schemas.openxmlformats.org/drawingml/2006/main" xmlns:pic="http://schemas.openxmlformats.org/drawingml/2006/picture" xmlns:c="http://schemas.openxmlformats.org/drawingml/2006/chart" xmlns:lc="http://schemas.openxmlformats.org/drawingml/2006/lockedCanvas" xmlns:dgm="http://schemas.openxmlformats.org/drawingml/2006/diagram" xmlns:wps="http://schemas.microsoft.com/office/word/2010/wordprocessingShape" xmlns:wpg="http://schemas.microsoft.com/office/word/2010/wordprocessingGroup" xmlns:w14="http://schemas.microsoft.com/office/word/2010/wordml" xmlns:w15="http://schemas.microsoft.com/office/word/2012/wordml" xmlns:w16="http://schemas.microsoft.com/office/word/2018/wordml" xmlns:w16cex="http://schemas.microsoft.com/office/word/2018/wordml/cex" xmlns:w16cid="http://schemas.microsoft.com/office/word/2016/wordml/cid" xmlns="http://schemas.microsoft.com/office/tasks/2019/documenttasks" xmlns:cr="http://schemas.microsoft.com/office/comments/2020/reactions">
+<w:hdr xmlns:wpc="http://schemas.microsoft.com/office/word/2010/wordprocessingCanvas" xmlns:cx="http://schemas.microsoft.com/office/drawing/2014/chartex" xmlns:cx1="http://schemas.microsoft.com/office/drawing/2015/9/8/chartex" xmlns:cx2="http://schemas.microsoft.com/office/drawing/2015/10/21/chartex" xmlns:cx3="http://schemas.microsoft.com/office/drawing/2016/5/9/chartex" xmlns:cx4="http://schemas.microsoft.com/office/drawing/2016/5/10/chartex" xmlns:cx5="http://schemas.microsoft.com/office/drawing/2016/5/11/chartex" xmlns:cx6="http://schemas.microsoft.com/office/drawing/2016/5/12/chartex" xmlns:cx7="http://schemas.microsoft.com/office/drawing/2016/5/13/chartex" xmlns:cx8="http://schemas.microsoft.com/office/drawing/2016/5/14/chartex" xmlns:mc="http://schemas.openxmlformats.org/markup-compatibility/2006" xmlns:aink="http://schemas.microsoft.com/office/drawing/2016/ink" xmlns:am3d="http://schemas.microsoft.com/office/drawing/2017/model3d" xmlns:o="urn:schemas-microsoft-com:office:office" xmlns:oel="http://schemas.microsoft.com/office/2019/extlst" xmlns:r="http://schemas.openxmlformats.org/officeDocument/2006/relationships" xmlns:m="http://schemas.openxmlformats.org/officeDocument/2006/math" xmlns:v="urn:schemas-microsoft-com:vml" xmlns:wp14="http://schemas.microsoft.com/office/word/2010/wordprocessingDrawing" xmlns:wp="http://schemas.openxmlformats.org/drawingml/2006/wordprocessingDrawing" xmlns:w10="urn:schemas-microsoft-com:office:word" xmlns:w="http://schemas.openxmlformats.org/wordprocessingml/2006/main" xmlns:w14="http://schemas.microsoft.com/office/word/2010/wordml" xmlns:w15="http://schemas.microsoft.com/office/word/2012/wordml" xmlns:w16cex="http://schemas.microsoft.com/office/word/2018/wordml/cex" xmlns:w16cid="http://schemas.microsoft.com/office/word/2016/wordml/cid" xmlns:w16="http://schemas.microsoft.com/office/word/2018/wordml" xmlns:w16du="http://schemas.microsoft.com/office/word/2023/wordml/word16du" xmlns:w16sdtdh="http://schemas.microsoft.com/office/word/2020/wordml/sdtdatahash" xmlns:w16sdtfl="http://schemas.microsoft.com/office/word/2024/wordml/sdtformatlock" xmlns:w16se="http://schemas.microsoft.com/office/word/2015/wordml/symex" xmlns:wpg="http://schemas.microsoft.com/office/word/2010/wordprocessingGroup" xmlns:wpi="http://schemas.microsoft.com/office/word/2010/wordprocessingInk" xmlns:wne="http://schemas.microsoft.com/office/word/2006/wordml" xmlns:wps="http://schemas.microsoft.com/office/word/2010/wordprocessingShape" mc:Ignorable="w14 w15 w16se w16cid w16 w16cex w16sdtdh w16sdtfl w16du wp14">
   <w:p>
     <w:pPr>
       <w:rPr>
@@ -1203,43 +973,64 @@
     <w:r>
       <w:rPr>
         <w:color w:val="434343"/>
-        <w:rtl w:val="0"/>
       </w:rPr>
       <w:t xml:space="preserve">Post Mortem Analyse.docx </w:t>
+    </w:r>
+    <w:r>
+      <w:rPr>
+        <w:color w:val="434343"/>
+      </w:rPr>
       <w:tab/>
       <w:t xml:space="preserve"> </w:t>
+    </w:r>
+    <w:r>
+      <w:rPr>
+        <w:color w:val="434343"/>
+      </w:rPr>
       <w:tab/>
       <w:t xml:space="preserve">   Team Rocket </w:t>
+    </w:r>
+    <w:r>
+      <w:rPr>
+        <w:color w:val="434343"/>
+      </w:rPr>
       <w:tab/>
       <w:t xml:space="preserve">           </w:t>
-      <w:tab/>
-      <w:tab/>
-      <w:tab/>
-      <w:t xml:space="preserve">26.06.2025</w:t>
     </w:r>
     <w:r>
       <w:rPr>
-        <w:rtl w:val="0"/>
-      </w:rPr>
+        <w:color w:val="434343"/>
+      </w:rPr>
+      <w:tab/>
+    </w:r>
+    <w:r>
+      <w:rPr>
+        <w:color w:val="434343"/>
+      </w:rPr>
+      <w:tab/>
+    </w:r>
+    <w:r>
+      <w:rPr>
+        <w:color w:val="434343"/>
+      </w:rPr>
+      <w:tab/>
+      <w:t>26.06.2025</w:t>
     </w:r>
   </w:p>
   <w:p>
     <w:pPr>
-      <w:spacing w:before="240" w:lineRule="auto"/>
-      <w:rPr/>
+      <w:spacing w:before="240"/>
     </w:pPr>
-    <w:r>
-      <w:rPr>
-        <w:rtl w:val="0"/>
-      </w:rPr>
-    </w:r>
   </w:p>
 </w:hdr>
 </file>
 
 <file path=word/numbering.xml><?xml version="1.0" encoding="utf-8"?>
-<w:numbering xmlns:mc="http://schemas.openxmlformats.org/markup-compatibility/2006" xmlns:o="urn:schemas-microsoft-com:office:office" xmlns:r="http://schemas.openxmlformats.org/officeDocument/2006/relationships" xmlns:m="http://schemas.openxmlformats.org/officeDocument/2006/math" xmlns:v="urn:schemas-microsoft-com:vml" xmlns:wp="http://schemas.openxmlformats.org/drawingml/2006/wordprocessingDrawing" xmlns:w10="urn:schemas-microsoft-com:office:word" xmlns:w="http://schemas.openxmlformats.org/wordprocessingml/2006/main" xmlns:wne="http://schemas.microsoft.com/office/word/2006/wordml" xmlns:sl="http://schemas.openxmlformats.org/schemaLibrary/2006/main" xmlns:a="http://schemas.openxmlformats.org/drawingml/2006/main" xmlns:pic="http://schemas.openxmlformats.org/drawingml/2006/picture" xmlns:c="http://schemas.openxmlformats.org/drawingml/2006/chart" xmlns:lc="http://schemas.openxmlformats.org/drawingml/2006/lockedCanvas" xmlns:dgm="http://schemas.openxmlformats.org/drawingml/2006/diagram" xmlns:wps="http://schemas.microsoft.com/office/word/2010/wordprocessingShape" xmlns:wpg="http://schemas.microsoft.com/office/word/2010/wordprocessingGroup" xmlns:w14="http://schemas.microsoft.com/office/word/2010/wordml" xmlns:w15="http://schemas.microsoft.com/office/word/2012/wordml" xmlns:w16="http://schemas.microsoft.com/office/word/2018/wordml" xmlns:w16cex="http://schemas.microsoft.com/office/word/2018/wordml/cex" xmlns:w16cid="http://schemas.microsoft.com/office/word/2016/wordml/cid" xmlns="http://schemas.microsoft.com/office/tasks/2019/documenttasks" xmlns:cr="http://schemas.microsoft.com/office/comments/2020/reactions">
-  <w:abstractNum w:abstractNumId="1">
+<w:numbering xmlns:wpc="http://schemas.microsoft.com/office/word/2010/wordprocessingCanvas" xmlns:cx="http://schemas.microsoft.com/office/drawing/2014/chartex" xmlns:cx1="http://schemas.microsoft.com/office/drawing/2015/9/8/chartex" xmlns:cx2="http://schemas.microsoft.com/office/drawing/2015/10/21/chartex" xmlns:cx3="http://schemas.microsoft.com/office/drawing/2016/5/9/chartex" xmlns:cx4="http://schemas.microsoft.com/office/drawing/2016/5/10/chartex" xmlns:cx5="http://schemas.microsoft.com/office/drawing/2016/5/11/chartex" xmlns:cx6="http://schemas.microsoft.com/office/drawing/2016/5/12/chartex" xmlns:cx7="http://schemas.microsoft.com/office/drawing/2016/5/13/chartex" xmlns:cx8="http://schemas.microsoft.com/office/drawing/2016/5/14/chartex" xmlns:mc="http://schemas.openxmlformats.org/markup-compatibility/2006" xmlns:aink="http://schemas.microsoft.com/office/drawing/2016/ink" xmlns:am3d="http://schemas.microsoft.com/office/drawing/2017/model3d" xmlns:o="urn:schemas-microsoft-com:office:office" xmlns:oel="http://schemas.microsoft.com/office/2019/extlst" xmlns:r="http://schemas.openxmlformats.org/officeDocument/2006/relationships" xmlns:m="http://schemas.openxmlformats.org/officeDocument/2006/math" xmlns:v="urn:schemas-microsoft-com:vml" xmlns:wp14="http://schemas.microsoft.com/office/word/2010/wordprocessingDrawing" xmlns:wp="http://schemas.openxmlformats.org/drawingml/2006/wordprocessingDrawing" xmlns:w10="urn:schemas-microsoft-com:office:word" xmlns:w="http://schemas.openxmlformats.org/wordprocessingml/2006/main" xmlns:w14="http://schemas.microsoft.com/office/word/2010/wordml" xmlns:w15="http://schemas.microsoft.com/office/word/2012/wordml" xmlns:w16cex="http://schemas.microsoft.com/office/word/2018/wordml/cex" xmlns:w16cid="http://schemas.microsoft.com/office/word/2016/wordml/cid" xmlns:w16="http://schemas.microsoft.com/office/word/2018/wordml" xmlns:w16du="http://schemas.microsoft.com/office/word/2023/wordml/word16du" xmlns:w16sdtdh="http://schemas.microsoft.com/office/word/2020/wordml/sdtdatahash" xmlns:w16sdtfl="http://schemas.microsoft.com/office/word/2024/wordml/sdtformatlock" xmlns:w16se="http://schemas.microsoft.com/office/word/2015/wordml/symex" xmlns:wpg="http://schemas.microsoft.com/office/word/2010/wordprocessingGroup" xmlns:wpi="http://schemas.microsoft.com/office/word/2010/wordprocessingInk" xmlns:wne="http://schemas.microsoft.com/office/word/2006/wordml" xmlns:wps="http://schemas.microsoft.com/office/word/2010/wordprocessingShape" mc:Ignorable="w14 w15 w16se w16cid w16 w16cex w16sdtdh w16sdtfl w16du wp14">
+  <w:abstractNum w:abstractNumId="0" w15:restartNumberingAfterBreak="0">
+    <w:nsid w:val="00404FAD"/>
+    <w:multiLevelType w:val="multilevel"/>
+    <w:tmpl w:val="A9B62AE2"/>
     <w:lvl w:ilvl="0">
       <w:start w:val="1"/>
       <w:numFmt w:val="bullet"/>
@@ -1349,7 +1140,10 @@
       </w:rPr>
     </w:lvl>
   </w:abstractNum>
-  <w:abstractNum w:abstractNumId="2">
+  <w:abstractNum w:abstractNumId="1" w15:restartNumberingAfterBreak="0">
+    <w:nsid w:val="0B295A0C"/>
+    <w:multiLevelType w:val="multilevel"/>
+    <w:tmpl w:val="6AFCE692"/>
     <w:lvl w:ilvl="0">
       <w:start w:val="1"/>
       <w:numFmt w:val="bullet"/>
@@ -1459,7 +1253,10 @@
       </w:rPr>
     </w:lvl>
   </w:abstractNum>
-  <w:abstractNum w:abstractNumId="3">
+  <w:abstractNum w:abstractNumId="2" w15:restartNumberingAfterBreak="0">
+    <w:nsid w:val="537748DF"/>
+    <w:multiLevelType w:val="multilevel"/>
+    <w:tmpl w:val="B8169634"/>
     <w:lvl w:ilvl="0">
       <w:start w:val="1"/>
       <w:numFmt w:val="bullet"/>
@@ -1569,7 +1366,10 @@
       </w:rPr>
     </w:lvl>
   </w:abstractNum>
-  <w:abstractNum w:abstractNumId="4">
+  <w:abstractNum w:abstractNumId="3" w15:restartNumberingAfterBreak="0">
+    <w:nsid w:val="58C53594"/>
+    <w:multiLevelType w:val="multilevel"/>
+    <w:tmpl w:val="5C06AB30"/>
     <w:lvl w:ilvl="0">
       <w:start w:val="1"/>
       <w:numFmt w:val="bullet"/>
@@ -1679,7 +1479,10 @@
       </w:rPr>
     </w:lvl>
   </w:abstractNum>
-  <w:abstractNum w:abstractNumId="5">
+  <w:abstractNum w:abstractNumId="4" w15:restartNumberingAfterBreak="0">
+    <w:nsid w:val="64F8492C"/>
+    <w:multiLevelType w:val="multilevel"/>
+    <w:tmpl w:val="D64A970E"/>
     <w:lvl w:ilvl="0">
       <w:start w:val="1"/>
       <w:numFmt w:val="bullet"/>
@@ -1789,33 +1592,33 @@
       </w:rPr>
     </w:lvl>
   </w:abstractNum>
-  <w:num w:numId="1">
-    <w:abstractNumId w:val="1"/>
+  <w:num w:numId="1" w16cid:durableId="1213230491">
+    <w:abstractNumId w:val="0"/>
   </w:num>
-  <w:num w:numId="2">
+  <w:num w:numId="2" w16cid:durableId="1448698184">
+    <w:abstractNumId w:val="3"/>
+  </w:num>
+  <w:num w:numId="3" w16cid:durableId="805506908">
+    <w:abstractNumId w:val="4"/>
+  </w:num>
+  <w:num w:numId="4" w16cid:durableId="1953121939">
     <w:abstractNumId w:val="2"/>
   </w:num>
-  <w:num w:numId="3">
-    <w:abstractNumId w:val="3"/>
-  </w:num>
-  <w:num w:numId="4">
-    <w:abstractNumId w:val="4"/>
-  </w:num>
-  <w:num w:numId="5">
-    <w:abstractNumId w:val="5"/>
+  <w:num w:numId="5" w16cid:durableId="1395816298">
+    <w:abstractNumId w:val="1"/>
   </w:num>
 </w:numbering>
 </file>
 
 <file path=word/styles.xml><?xml version="1.0" encoding="utf-8"?>
-<w:styles xmlns:mc="http://schemas.openxmlformats.org/markup-compatibility/2006" xmlns:o="urn:schemas-microsoft-com:office:office" xmlns:r="http://schemas.openxmlformats.org/officeDocument/2006/relationships" xmlns:m="http://schemas.openxmlformats.org/officeDocument/2006/math" xmlns:v="urn:schemas-microsoft-com:vml" xmlns:wp="http://schemas.openxmlformats.org/drawingml/2006/wordprocessingDrawing" xmlns:w10="urn:schemas-microsoft-com:office:word" xmlns:w="http://schemas.openxmlformats.org/wordprocessingml/2006/main" xmlns:wne="http://schemas.microsoft.com/office/word/2006/wordml" xmlns:sl="http://schemas.openxmlformats.org/schemaLibrary/2006/main" xmlns:a="http://schemas.openxmlformats.org/drawingml/2006/main" xmlns:pic="http://schemas.openxmlformats.org/drawingml/2006/picture" xmlns:c="http://schemas.openxmlformats.org/drawingml/2006/chart" xmlns:lc="http://schemas.openxmlformats.org/drawingml/2006/lockedCanvas" xmlns:dgm="http://schemas.openxmlformats.org/drawingml/2006/diagram" xmlns:wps="http://schemas.microsoft.com/office/word/2010/wordprocessingShape" xmlns:wpg="http://schemas.microsoft.com/office/word/2010/wordprocessingGroup" xmlns:w14="http://schemas.microsoft.com/office/word/2010/wordml" xmlns:w15="http://schemas.microsoft.com/office/word/2012/wordml" xmlns:w16="http://schemas.microsoft.com/office/word/2018/wordml" xmlns:w16cex="http://schemas.microsoft.com/office/word/2018/wordml/cex" xmlns:w16cid="http://schemas.microsoft.com/office/word/2016/wordml/cid" xmlns="http://schemas.microsoft.com/office/tasks/2019/documenttasks" xmlns:cr="http://schemas.microsoft.com/office/comments/2020/reactions">
+<w:styles xmlns:mc="http://schemas.openxmlformats.org/markup-compatibility/2006" xmlns:r="http://schemas.openxmlformats.org/officeDocument/2006/relationships" xmlns:w="http://schemas.openxmlformats.org/wordprocessingml/2006/main" xmlns:w14="http://schemas.microsoft.com/office/word/2010/wordml" xmlns:w15="http://schemas.microsoft.com/office/word/2012/wordml" xmlns:w16cex="http://schemas.microsoft.com/office/word/2018/wordml/cex" xmlns:w16cid="http://schemas.microsoft.com/office/word/2016/wordml/cid" xmlns:w16="http://schemas.microsoft.com/office/word/2018/wordml" xmlns:w16du="http://schemas.microsoft.com/office/word/2023/wordml/word16du" xmlns:w16sdtdh="http://schemas.microsoft.com/office/word/2020/wordml/sdtdatahash" xmlns:w16sdtfl="http://schemas.microsoft.com/office/word/2024/wordml/sdtformatlock" xmlns:w16se="http://schemas.microsoft.com/office/word/2015/wordml/symex" mc:Ignorable="w14 w15 w16se w16cid w16 w16cex w16sdtdh w16sdtfl w16du">
   <w:docDefaults>
     <w:rPrDefault>
       <w:rPr>
-        <w:rFonts w:ascii="Arial" w:cs="Arial" w:eastAsia="Arial" w:hAnsi="Arial"/>
+        <w:rFonts w:ascii="Arial" w:eastAsia="Arial" w:hAnsi="Arial" w:cs="Arial"/>
         <w:sz w:val="22"/>
         <w:szCs w:val="22"/>
-        <w:lang w:val="de"/>
+        <w:lang w:val="de" w:eastAsia="de-DE" w:bidi="ar-SA"/>
       </w:rPr>
     </w:rPrDefault>
     <w:pPrDefault>
@@ -1824,69 +1627,456 @@
       </w:pPr>
     </w:pPrDefault>
   </w:docDefaults>
-  <w:style w:type="paragraph" w:styleId="Normal" w:default="1">
-    <w:name w:val="normal"/>
+  <w:latentStyles w:defLockedState="0" w:defUIPriority="99" w:defSemiHidden="0" w:defUnhideWhenUsed="0" w:defQFormat="0" w:count="376">
+    <w:lsdException w:name="Normal" w:uiPriority="0" w:qFormat="1"/>
+    <w:lsdException w:name="heading 1" w:uiPriority="9" w:qFormat="1"/>
+    <w:lsdException w:name="heading 2" w:semiHidden="1" w:uiPriority="9" w:unhideWhenUsed="1" w:qFormat="1"/>
+    <w:lsdException w:name="heading 3" w:semiHidden="1" w:uiPriority="9" w:unhideWhenUsed="1" w:qFormat="1"/>
+    <w:lsdException w:name="heading 4" w:semiHidden="1" w:uiPriority="9" w:unhideWhenUsed="1" w:qFormat="1"/>
+    <w:lsdException w:name="heading 5" w:semiHidden="1" w:uiPriority="9" w:unhideWhenUsed="1" w:qFormat="1"/>
+    <w:lsdException w:name="heading 6" w:semiHidden="1" w:uiPriority="9" w:unhideWhenUsed="1" w:qFormat="1"/>
+    <w:lsdException w:name="heading 7" w:semiHidden="1" w:uiPriority="9" w:unhideWhenUsed="1" w:qFormat="1"/>
+    <w:lsdException w:name="heading 8" w:semiHidden="1" w:uiPriority="9" w:unhideWhenUsed="1" w:qFormat="1"/>
+    <w:lsdException w:name="heading 9" w:semiHidden="1" w:uiPriority="9" w:unhideWhenUsed="1" w:qFormat="1"/>
+    <w:lsdException w:name="index 1" w:semiHidden="1" w:unhideWhenUsed="1"/>
+    <w:lsdException w:name="index 2" w:semiHidden="1" w:unhideWhenUsed="1"/>
+    <w:lsdException w:name="index 3" w:semiHidden="1" w:unhideWhenUsed="1"/>
+    <w:lsdException w:name="index 4" w:semiHidden="1" w:unhideWhenUsed="1"/>
+    <w:lsdException w:name="index 5" w:semiHidden="1" w:unhideWhenUsed="1"/>
+    <w:lsdException w:name="index 6" w:semiHidden="1" w:unhideWhenUsed="1"/>
+    <w:lsdException w:name="index 7" w:semiHidden="1" w:unhideWhenUsed="1"/>
+    <w:lsdException w:name="index 8" w:semiHidden="1" w:unhideWhenUsed="1"/>
+    <w:lsdException w:name="index 9" w:semiHidden="1" w:unhideWhenUsed="1"/>
+    <w:lsdException w:name="toc 1" w:semiHidden="1" w:uiPriority="39" w:unhideWhenUsed="1"/>
+    <w:lsdException w:name="toc 2" w:semiHidden="1" w:uiPriority="39" w:unhideWhenUsed="1"/>
+    <w:lsdException w:name="toc 3" w:semiHidden="1" w:uiPriority="39" w:unhideWhenUsed="1"/>
+    <w:lsdException w:name="toc 4" w:semiHidden="1" w:uiPriority="39" w:unhideWhenUsed="1"/>
+    <w:lsdException w:name="toc 5" w:semiHidden="1" w:uiPriority="39" w:unhideWhenUsed="1"/>
+    <w:lsdException w:name="toc 6" w:semiHidden="1" w:uiPriority="39" w:unhideWhenUsed="1"/>
+    <w:lsdException w:name="toc 7" w:semiHidden="1" w:uiPriority="39" w:unhideWhenUsed="1"/>
+    <w:lsdException w:name="toc 8" w:semiHidden="1" w:uiPriority="39" w:unhideWhenUsed="1"/>
+    <w:lsdException w:name="toc 9" w:semiHidden="1" w:uiPriority="39" w:unhideWhenUsed="1"/>
+    <w:lsdException w:name="Normal Indent" w:semiHidden="1" w:unhideWhenUsed="1"/>
+    <w:lsdException w:name="footnote text" w:semiHidden="1" w:unhideWhenUsed="1"/>
+    <w:lsdException w:name="annotation text" w:semiHidden="1" w:unhideWhenUsed="1"/>
+    <w:lsdException w:name="header" w:semiHidden="1" w:unhideWhenUsed="1"/>
+    <w:lsdException w:name="footer" w:semiHidden="1" w:unhideWhenUsed="1"/>
+    <w:lsdException w:name="index heading" w:semiHidden="1" w:unhideWhenUsed="1"/>
+    <w:lsdException w:name="caption" w:semiHidden="1" w:uiPriority="35" w:unhideWhenUsed="1" w:qFormat="1"/>
+    <w:lsdException w:name="table of figures" w:semiHidden="1" w:unhideWhenUsed="1"/>
+    <w:lsdException w:name="envelope address" w:semiHidden="1" w:unhideWhenUsed="1"/>
+    <w:lsdException w:name="envelope return" w:semiHidden="1" w:unhideWhenUsed="1"/>
+    <w:lsdException w:name="footnote reference" w:semiHidden="1" w:unhideWhenUsed="1"/>
+    <w:lsdException w:name="annotation reference" w:semiHidden="1" w:unhideWhenUsed="1"/>
+    <w:lsdException w:name="line number" w:semiHidden="1" w:unhideWhenUsed="1"/>
+    <w:lsdException w:name="page number" w:semiHidden="1" w:unhideWhenUsed="1"/>
+    <w:lsdException w:name="endnote reference" w:semiHidden="1" w:unhideWhenUsed="1"/>
+    <w:lsdException w:name="endnote text" w:semiHidden="1" w:unhideWhenUsed="1"/>
+    <w:lsdException w:name="table of authorities" w:semiHidden="1" w:unhideWhenUsed="1"/>
+    <w:lsdException w:name="macro" w:semiHidden="1" w:unhideWhenUsed="1"/>
+    <w:lsdException w:name="toa heading" w:semiHidden="1" w:unhideWhenUsed="1"/>
+    <w:lsdException w:name="List" w:semiHidden="1" w:unhideWhenUsed="1"/>
+    <w:lsdException w:name="List Bullet" w:semiHidden="1" w:unhideWhenUsed="1"/>
+    <w:lsdException w:name="List Number" w:semiHidden="1" w:unhideWhenUsed="1"/>
+    <w:lsdException w:name="List 2" w:semiHidden="1" w:unhideWhenUsed="1"/>
+    <w:lsdException w:name="List 3" w:semiHidden="1" w:unhideWhenUsed="1"/>
+    <w:lsdException w:name="List 4" w:semiHidden="1" w:unhideWhenUsed="1"/>
+    <w:lsdException w:name="List 5" w:semiHidden="1" w:unhideWhenUsed="1"/>
+    <w:lsdException w:name="List Bullet 2" w:semiHidden="1" w:unhideWhenUsed="1"/>
+    <w:lsdException w:name="List Bullet 3" w:semiHidden="1" w:unhideWhenUsed="1"/>
+    <w:lsdException w:name="List Bullet 4" w:semiHidden="1" w:unhideWhenUsed="1"/>
+    <w:lsdException w:name="List Bullet 5" w:semiHidden="1" w:unhideWhenUsed="1"/>
+    <w:lsdException w:name="List Number 2" w:semiHidden="1" w:unhideWhenUsed="1"/>
+    <w:lsdException w:name="List Number 3" w:semiHidden="1" w:unhideWhenUsed="1"/>
+    <w:lsdException w:name="List Number 4" w:semiHidden="1" w:unhideWhenUsed="1"/>
+    <w:lsdException w:name="List Number 5" w:semiHidden="1" w:unhideWhenUsed="1"/>
+    <w:lsdException w:name="Title" w:uiPriority="10" w:qFormat="1"/>
+    <w:lsdException w:name="Closing" w:semiHidden="1" w:unhideWhenUsed="1"/>
+    <w:lsdException w:name="Signature" w:semiHidden="1" w:unhideWhenUsed="1"/>
+    <w:lsdException w:name="Default Paragraph Font" w:semiHidden="1" w:uiPriority="1" w:unhideWhenUsed="1"/>
+    <w:lsdException w:name="Body Text" w:semiHidden="1" w:unhideWhenUsed="1"/>
+    <w:lsdException w:name="Body Text Indent" w:semiHidden="1" w:unhideWhenUsed="1"/>
+    <w:lsdException w:name="List Continue" w:semiHidden="1" w:unhideWhenUsed="1"/>
+    <w:lsdException w:name="List Continue 2" w:semiHidden="1" w:unhideWhenUsed="1"/>
+    <w:lsdException w:name="List Continue 3" w:semiHidden="1" w:unhideWhenUsed="1"/>
+    <w:lsdException w:name="List Continue 4" w:semiHidden="1" w:unhideWhenUsed="1"/>
+    <w:lsdException w:name="List Continue 5" w:semiHidden="1" w:unhideWhenUsed="1"/>
+    <w:lsdException w:name="Message Header" w:semiHidden="1" w:unhideWhenUsed="1"/>
+    <w:lsdException w:name="Subtitle" w:uiPriority="11" w:qFormat="1"/>
+    <w:lsdException w:name="Salutation" w:semiHidden="1" w:unhideWhenUsed="1"/>
+    <w:lsdException w:name="Date" w:semiHidden="1" w:unhideWhenUsed="1"/>
+    <w:lsdException w:name="Body Text First Indent" w:semiHidden="1" w:unhideWhenUsed="1"/>
+    <w:lsdException w:name="Body Text First Indent 2" w:semiHidden="1" w:unhideWhenUsed="1"/>
+    <w:lsdException w:name="Note Heading" w:semiHidden="1" w:unhideWhenUsed="1"/>
+    <w:lsdException w:name="Body Text 2" w:semiHidden="1" w:unhideWhenUsed="1"/>
+    <w:lsdException w:name="Body Text 3" w:semiHidden="1" w:unhideWhenUsed="1"/>
+    <w:lsdException w:name="Body Text Indent 2" w:semiHidden="1" w:unhideWhenUsed="1"/>
+    <w:lsdException w:name="Body Text Indent 3" w:semiHidden="1" w:unhideWhenUsed="1"/>
+    <w:lsdException w:name="Block Text" w:semiHidden="1" w:unhideWhenUsed="1"/>
+    <w:lsdException w:name="Hyperlink" w:semiHidden="1" w:unhideWhenUsed="1"/>
+    <w:lsdException w:name="FollowedHyperlink" w:semiHidden="1" w:unhideWhenUsed="1"/>
+    <w:lsdException w:name="Strong" w:uiPriority="22" w:qFormat="1"/>
+    <w:lsdException w:name="Emphasis" w:uiPriority="20" w:qFormat="1"/>
+    <w:lsdException w:name="Document Map" w:semiHidden="1" w:unhideWhenUsed="1"/>
+    <w:lsdException w:name="Plain Text" w:semiHidden="1" w:unhideWhenUsed="1"/>
+    <w:lsdException w:name="E-mail Signature" w:semiHidden="1" w:unhideWhenUsed="1"/>
+    <w:lsdException w:name="HTML Top of Form" w:semiHidden="1" w:unhideWhenUsed="1"/>
+    <w:lsdException w:name="HTML Bottom of Form" w:semiHidden="1" w:unhideWhenUsed="1"/>
+    <w:lsdException w:name="Normal (Web)" w:semiHidden="1" w:unhideWhenUsed="1"/>
+    <w:lsdException w:name="HTML Acronym" w:semiHidden="1" w:unhideWhenUsed="1"/>
+    <w:lsdException w:name="HTML Address" w:semiHidden="1" w:unhideWhenUsed="1"/>
+    <w:lsdException w:name="HTML Cite" w:semiHidden="1" w:unhideWhenUsed="1"/>
+    <w:lsdException w:name="HTML Code" w:semiHidden="1" w:unhideWhenUsed="1"/>
+    <w:lsdException w:name="HTML Definition" w:semiHidden="1" w:unhideWhenUsed="1"/>
+    <w:lsdException w:name="HTML Keyboard" w:semiHidden="1" w:unhideWhenUsed="1"/>
+    <w:lsdException w:name="HTML Preformatted" w:semiHidden="1" w:unhideWhenUsed="1"/>
+    <w:lsdException w:name="HTML Sample" w:semiHidden="1" w:unhideWhenUsed="1"/>
+    <w:lsdException w:name="HTML Typewriter" w:semiHidden="1" w:unhideWhenUsed="1"/>
+    <w:lsdException w:name="HTML Variable" w:semiHidden="1" w:unhideWhenUsed="1"/>
+    <w:lsdException w:name="Normal Table" w:semiHidden="1" w:unhideWhenUsed="1"/>
+    <w:lsdException w:name="annotation subject" w:semiHidden="1" w:unhideWhenUsed="1"/>
+    <w:lsdException w:name="No List" w:semiHidden="1" w:unhideWhenUsed="1"/>
+    <w:lsdException w:name="Outline List 1" w:semiHidden="1" w:unhideWhenUsed="1"/>
+    <w:lsdException w:name="Outline List 2" w:semiHidden="1" w:unhideWhenUsed="1"/>
+    <w:lsdException w:name="Outline List 3" w:semiHidden="1" w:unhideWhenUsed="1"/>
+    <w:lsdException w:name="Table Simple 1" w:semiHidden="1" w:unhideWhenUsed="1"/>
+    <w:lsdException w:name="Table Simple 2" w:semiHidden="1" w:unhideWhenUsed="1"/>
+    <w:lsdException w:name="Table Simple 3" w:semiHidden="1" w:unhideWhenUsed="1"/>
+    <w:lsdException w:name="Table Classic 1" w:semiHidden="1" w:unhideWhenUsed="1"/>
+    <w:lsdException w:name="Table Classic 2" w:semiHidden="1" w:unhideWhenUsed="1"/>
+    <w:lsdException w:name="Table Classic 3" w:semiHidden="1" w:unhideWhenUsed="1"/>
+    <w:lsdException w:name="Table Classic 4" w:semiHidden="1" w:unhideWhenUsed="1"/>
+    <w:lsdException w:name="Table Colorful 1" w:semiHidden="1" w:unhideWhenUsed="1"/>
+    <w:lsdException w:name="Table Colorful 2" w:semiHidden="1" w:unhideWhenUsed="1"/>
+    <w:lsdException w:name="Table Colorful 3" w:semiHidden="1" w:unhideWhenUsed="1"/>
+    <w:lsdException w:name="Table Columns 1" w:semiHidden="1" w:unhideWhenUsed="1"/>
+    <w:lsdException w:name="Table Columns 2" w:semiHidden="1" w:unhideWhenUsed="1"/>
+    <w:lsdException w:name="Table Columns 3" w:semiHidden="1" w:unhideWhenUsed="1"/>
+    <w:lsdException w:name="Table Columns 4" w:semiHidden="1" w:unhideWhenUsed="1"/>
+    <w:lsdException w:name="Table Columns 5" w:semiHidden="1" w:unhideWhenUsed="1"/>
+    <w:lsdException w:name="Table Grid 1" w:semiHidden="1" w:unhideWhenUsed="1"/>
+    <w:lsdException w:name="Table Grid 2" w:semiHidden="1" w:unhideWhenUsed="1"/>
+    <w:lsdException w:name="Table Grid 3" w:semiHidden="1" w:unhideWhenUsed="1"/>
+    <w:lsdException w:name="Table Grid 4" w:semiHidden="1" w:unhideWhenUsed="1"/>
+    <w:lsdException w:name="Table Grid 5" w:semiHidden="1" w:unhideWhenUsed="1"/>
+    <w:lsdException w:name="Table Grid 6" w:semiHidden="1" w:unhideWhenUsed="1"/>
+    <w:lsdException w:name="Table Grid 7" w:semiHidden="1" w:unhideWhenUsed="1"/>
+    <w:lsdException w:name="Table Grid 8" w:semiHidden="1" w:unhideWhenUsed="1"/>
+    <w:lsdException w:name="Table List 1" w:semiHidden="1" w:unhideWhenUsed="1"/>
+    <w:lsdException w:name="Table List 2" w:semiHidden="1" w:unhideWhenUsed="1"/>
+    <w:lsdException w:name="Table List 3" w:semiHidden="1" w:unhideWhenUsed="1"/>
+    <w:lsdException w:name="Table List 4" w:semiHidden="1" w:unhideWhenUsed="1"/>
+    <w:lsdException w:name="Table List 5" w:semiHidden="1" w:unhideWhenUsed="1"/>
+    <w:lsdException w:name="Table List 6" w:semiHidden="1" w:unhideWhenUsed="1"/>
+    <w:lsdException w:name="Table List 7" w:semiHidden="1" w:unhideWhenUsed="1"/>
+    <w:lsdException w:name="Table List 8" w:semiHidden="1" w:unhideWhenUsed="1"/>
+    <w:lsdException w:name="Table 3D effects 1" w:semiHidden="1" w:unhideWhenUsed="1"/>
+    <w:lsdException w:name="Table 3D effects 2" w:semiHidden="1" w:unhideWhenUsed="1"/>
+    <w:lsdException w:name="Table 3D effects 3" w:semiHidden="1" w:unhideWhenUsed="1"/>
+    <w:lsdException w:name="Table Contemporary" w:semiHidden="1" w:unhideWhenUsed="1"/>
+    <w:lsdException w:name="Table Elegant" w:semiHidden="1" w:unhideWhenUsed="1"/>
+    <w:lsdException w:name="Table Professional" w:semiHidden="1" w:unhideWhenUsed="1"/>
+    <w:lsdException w:name="Table Subtle 1" w:semiHidden="1" w:unhideWhenUsed="1"/>
+    <w:lsdException w:name="Table Subtle 2" w:semiHidden="1" w:unhideWhenUsed="1"/>
+    <w:lsdException w:name="Table Web 1" w:semiHidden="1" w:unhideWhenUsed="1"/>
+    <w:lsdException w:name="Table Web 2" w:semiHidden="1" w:unhideWhenUsed="1"/>
+    <w:lsdException w:name="Table Web 3" w:semiHidden="1" w:unhideWhenUsed="1"/>
+    <w:lsdException w:name="Balloon Text" w:semiHidden="1" w:unhideWhenUsed="1"/>
+    <w:lsdException w:name="Table Grid" w:uiPriority="39"/>
+    <w:lsdException w:name="Table Theme" w:semiHidden="1" w:unhideWhenUsed="1"/>
+    <w:lsdException w:name="Placeholder Text" w:semiHidden="1"/>
+    <w:lsdException w:name="No Spacing" w:uiPriority="1" w:qFormat="1"/>
+    <w:lsdException w:name="Light Shading" w:uiPriority="60"/>
+    <w:lsdException w:name="Light List" w:uiPriority="61"/>
+    <w:lsdException w:name="Light Grid" w:uiPriority="62"/>
+    <w:lsdException w:name="Medium Shading 1" w:uiPriority="63"/>
+    <w:lsdException w:name="Medium Shading 2" w:uiPriority="64"/>
+    <w:lsdException w:name="Medium List 1" w:uiPriority="65"/>
+    <w:lsdException w:name="Medium List 2" w:uiPriority="66"/>
+    <w:lsdException w:name="Medium Grid 1" w:uiPriority="67"/>
+    <w:lsdException w:name="Medium Grid 2" w:uiPriority="68"/>
+    <w:lsdException w:name="Medium Grid 3" w:uiPriority="69"/>
+    <w:lsdException w:name="Dark List" w:uiPriority="70"/>
+    <w:lsdException w:name="Colorful Shading" w:uiPriority="71"/>
+    <w:lsdException w:name="Colorful List" w:uiPriority="72"/>
+    <w:lsdException w:name="Colorful Grid" w:uiPriority="73"/>
+    <w:lsdException w:name="Light Shading Accent 1" w:uiPriority="60"/>
+    <w:lsdException w:name="Light List Accent 1" w:uiPriority="61"/>
+    <w:lsdException w:name="Light Grid Accent 1" w:uiPriority="62"/>
+    <w:lsdException w:name="Medium Shading 1 Accent 1" w:uiPriority="63"/>
+    <w:lsdException w:name="Medium Shading 2 Accent 1" w:uiPriority="64"/>
+    <w:lsdException w:name="Medium List 1 Accent 1" w:uiPriority="65"/>
+    <w:lsdException w:name="Revision" w:semiHidden="1"/>
+    <w:lsdException w:name="List Paragraph" w:uiPriority="34" w:qFormat="1"/>
+    <w:lsdException w:name="Quote" w:uiPriority="29" w:qFormat="1"/>
+    <w:lsdException w:name="Intense Quote" w:uiPriority="30" w:qFormat="1"/>
+    <w:lsdException w:name="Medium List 2 Accent 1" w:uiPriority="66"/>
+    <w:lsdException w:name="Medium Grid 1 Accent 1" w:uiPriority="67"/>
+    <w:lsdException w:name="Medium Grid 2 Accent 1" w:uiPriority="68"/>
+    <w:lsdException w:name="Medium Grid 3 Accent 1" w:uiPriority="69"/>
+    <w:lsdException w:name="Dark List Accent 1" w:uiPriority="70"/>
+    <w:lsdException w:name="Colorful Shading Accent 1" w:uiPriority="71"/>
+    <w:lsdException w:name="Colorful List Accent 1" w:uiPriority="72"/>
+    <w:lsdException w:name="Colorful Grid Accent 1" w:uiPriority="73"/>
+    <w:lsdException w:name="Light Shading Accent 2" w:uiPriority="60"/>
+    <w:lsdException w:name="Light List Accent 2" w:uiPriority="61"/>
+    <w:lsdException w:name="Light Grid Accent 2" w:uiPriority="62"/>
+    <w:lsdException w:name="Medium Shading 1 Accent 2" w:uiPriority="63"/>
+    <w:lsdException w:name="Medium Shading 2 Accent 2" w:uiPriority="64"/>
+    <w:lsdException w:name="Medium List 1 Accent 2" w:uiPriority="65"/>
+    <w:lsdException w:name="Medium List 2 Accent 2" w:uiPriority="66"/>
+    <w:lsdException w:name="Medium Grid 1 Accent 2" w:uiPriority="67"/>
+    <w:lsdException w:name="Medium Grid 2 Accent 2" w:uiPriority="68"/>
+    <w:lsdException w:name="Medium Grid 3 Accent 2" w:uiPriority="69"/>
+    <w:lsdException w:name="Dark List Accent 2" w:uiPriority="70"/>
+    <w:lsdException w:name="Colorful Shading Accent 2" w:uiPriority="71"/>
+    <w:lsdException w:name="Colorful List Accent 2" w:uiPriority="72"/>
+    <w:lsdException w:name="Colorful Grid Accent 2" w:uiPriority="73"/>
+    <w:lsdException w:name="Light Shading Accent 3" w:uiPriority="60"/>
+    <w:lsdException w:name="Light List Accent 3" w:uiPriority="61"/>
+    <w:lsdException w:name="Light Grid Accent 3" w:uiPriority="62"/>
+    <w:lsdException w:name="Medium Shading 1 Accent 3" w:uiPriority="63"/>
+    <w:lsdException w:name="Medium Shading 2 Accent 3" w:uiPriority="64"/>
+    <w:lsdException w:name="Medium List 1 Accent 3" w:uiPriority="65"/>
+    <w:lsdException w:name="Medium List 2 Accent 3" w:uiPriority="66"/>
+    <w:lsdException w:name="Medium Grid 1 Accent 3" w:uiPriority="67"/>
+    <w:lsdException w:name="Medium Grid 2 Accent 3" w:uiPriority="68"/>
+    <w:lsdException w:name="Medium Grid 3 Accent 3" w:uiPriority="69"/>
+    <w:lsdException w:name="Dark List Accent 3" w:uiPriority="70"/>
+    <w:lsdException w:name="Colorful Shading Accent 3" w:uiPriority="71"/>
+    <w:lsdException w:name="Colorful List Accent 3" w:uiPriority="72"/>
+    <w:lsdException w:name="Colorful Grid Accent 3" w:uiPriority="73"/>
+    <w:lsdException w:name="Light Shading Accent 4" w:uiPriority="60"/>
+    <w:lsdException w:name="Light List Accent 4" w:uiPriority="61"/>
+    <w:lsdException w:name="Light Grid Accent 4" w:uiPriority="62"/>
+    <w:lsdException w:name="Medium Shading 1 Accent 4" w:uiPriority="63"/>
+    <w:lsdException w:name="Medium Shading 2 Accent 4" w:uiPriority="64"/>
+    <w:lsdException w:name="Medium List 1 Accent 4" w:uiPriority="65"/>
+    <w:lsdException w:name="Medium List 2 Accent 4" w:uiPriority="66"/>
+    <w:lsdException w:name="Medium Grid 1 Accent 4" w:uiPriority="67"/>
+    <w:lsdException w:name="Medium Grid 2 Accent 4" w:uiPriority="68"/>
+    <w:lsdException w:name="Medium Grid 3 Accent 4" w:uiPriority="69"/>
+    <w:lsdException w:name="Dark List Accent 4" w:uiPriority="70"/>
+    <w:lsdException w:name="Colorful Shading Accent 4" w:uiPriority="71"/>
+    <w:lsdException w:name="Colorful List Accent 4" w:uiPriority="72"/>
+    <w:lsdException w:name="Colorful Grid Accent 4" w:uiPriority="73"/>
+    <w:lsdException w:name="Light Shading Accent 5" w:uiPriority="60"/>
+    <w:lsdException w:name="Light List Accent 5" w:uiPriority="61"/>
+    <w:lsdException w:name="Light Grid Accent 5" w:uiPriority="62"/>
+    <w:lsdException w:name="Medium Shading 1 Accent 5" w:uiPriority="63"/>
+    <w:lsdException w:name="Medium Shading 2 Accent 5" w:uiPriority="64"/>
+    <w:lsdException w:name="Medium List 1 Accent 5" w:uiPriority="65"/>
+    <w:lsdException w:name="Medium List 2 Accent 5" w:uiPriority="66"/>
+    <w:lsdException w:name="Medium Grid 1 Accent 5" w:uiPriority="67"/>
+    <w:lsdException w:name="Medium Grid 2 Accent 5" w:uiPriority="68"/>
+    <w:lsdException w:name="Medium Grid 3 Accent 5" w:uiPriority="69"/>
+    <w:lsdException w:name="Dark List Accent 5" w:uiPriority="70"/>
+    <w:lsdException w:name="Colorful Shading Accent 5" w:uiPriority="71"/>
+    <w:lsdException w:name="Colorful List Accent 5" w:uiPriority="72"/>
+    <w:lsdException w:name="Colorful Grid Accent 5" w:uiPriority="73"/>
+    <w:lsdException w:name="Light Shading Accent 6" w:uiPriority="60"/>
+    <w:lsdException w:name="Light List Accent 6" w:uiPriority="61"/>
+    <w:lsdException w:name="Light Grid Accent 6" w:uiPriority="62"/>
+    <w:lsdException w:name="Medium Shading 1 Accent 6" w:uiPriority="63"/>
+    <w:lsdException w:name="Medium Shading 2 Accent 6" w:uiPriority="64"/>
+    <w:lsdException w:name="Medium List 1 Accent 6" w:uiPriority="65"/>
+    <w:lsdException w:name="Medium List 2 Accent 6" w:uiPriority="66"/>
+    <w:lsdException w:name="Medium Grid 1 Accent 6" w:uiPriority="67"/>
+    <w:lsdException w:name="Medium Grid 2 Accent 6" w:uiPriority="68"/>
+    <w:lsdException w:name="Medium Grid 3 Accent 6" w:uiPriority="69"/>
+    <w:lsdException w:name="Dark List Accent 6" w:uiPriority="70"/>
+    <w:lsdException w:name="Colorful Shading Accent 6" w:uiPriority="71"/>
+    <w:lsdException w:name="Colorful List Accent 6" w:uiPriority="72"/>
+    <w:lsdException w:name="Colorful Grid Accent 6" w:uiPriority="73"/>
+    <w:lsdException w:name="Subtle Emphasis" w:uiPriority="19" w:qFormat="1"/>
+    <w:lsdException w:name="Intense Emphasis" w:uiPriority="21" w:qFormat="1"/>
+    <w:lsdException w:name="Subtle Reference" w:uiPriority="31" w:qFormat="1"/>
+    <w:lsdException w:name="Intense Reference" w:uiPriority="32" w:qFormat="1"/>
+    <w:lsdException w:name="Book Title" w:uiPriority="33" w:qFormat="1"/>
+    <w:lsdException w:name="Bibliography" w:semiHidden="1" w:uiPriority="37" w:unhideWhenUsed="1"/>
+    <w:lsdException w:name="TOC Heading" w:semiHidden="1" w:uiPriority="39" w:unhideWhenUsed="1" w:qFormat="1"/>
+    <w:lsdException w:name="Plain Table 1" w:uiPriority="41"/>
+    <w:lsdException w:name="Plain Table 2" w:uiPriority="42"/>
+    <w:lsdException w:name="Plain Table 3" w:uiPriority="43"/>
+    <w:lsdException w:name="Plain Table 4" w:uiPriority="44"/>
+    <w:lsdException w:name="Plain Table 5" w:uiPriority="45"/>
+    <w:lsdException w:name="Grid Table Light" w:uiPriority="40"/>
+    <w:lsdException w:name="Grid Table 1 Light" w:uiPriority="46"/>
+    <w:lsdException w:name="Grid Table 2" w:uiPriority="47"/>
+    <w:lsdException w:name="Grid Table 3" w:uiPriority="48"/>
+    <w:lsdException w:name="Grid Table 4" w:uiPriority="49"/>
+    <w:lsdException w:name="Grid Table 5 Dark" w:uiPriority="50"/>
+    <w:lsdException w:name="Grid Table 6 Colorful" w:uiPriority="51"/>
+    <w:lsdException w:name="Grid Table 7 Colorful" w:uiPriority="52"/>
+    <w:lsdException w:name="Grid Table 1 Light Accent 1" w:uiPriority="46"/>
+    <w:lsdException w:name="Grid Table 2 Accent 1" w:uiPriority="47"/>
+    <w:lsdException w:name="Grid Table 3 Accent 1" w:uiPriority="48"/>
+    <w:lsdException w:name="Grid Table 4 Accent 1" w:uiPriority="49"/>
+    <w:lsdException w:name="Grid Table 5 Dark Accent 1" w:uiPriority="50"/>
+    <w:lsdException w:name="Grid Table 6 Colorful Accent 1" w:uiPriority="51"/>
+    <w:lsdException w:name="Grid Table 7 Colorful Accent 1" w:uiPriority="52"/>
+    <w:lsdException w:name="Grid Table 1 Light Accent 2" w:uiPriority="46"/>
+    <w:lsdException w:name="Grid Table 2 Accent 2" w:uiPriority="47"/>
+    <w:lsdException w:name="Grid Table 3 Accent 2" w:uiPriority="48"/>
+    <w:lsdException w:name="Grid Table 4 Accent 2" w:uiPriority="49"/>
+    <w:lsdException w:name="Grid Table 5 Dark Accent 2" w:uiPriority="50"/>
+    <w:lsdException w:name="Grid Table 6 Colorful Accent 2" w:uiPriority="51"/>
+    <w:lsdException w:name="Grid Table 7 Colorful Accent 2" w:uiPriority="52"/>
+    <w:lsdException w:name="Grid Table 1 Light Accent 3" w:uiPriority="46"/>
+    <w:lsdException w:name="Grid Table 2 Accent 3" w:uiPriority="47"/>
+    <w:lsdException w:name="Grid Table 3 Accent 3" w:uiPriority="48"/>
+    <w:lsdException w:name="Grid Table 4 Accent 3" w:uiPriority="49"/>
+    <w:lsdException w:name="Grid Table 5 Dark Accent 3" w:uiPriority="50"/>
+    <w:lsdException w:name="Grid Table 6 Colorful Accent 3" w:uiPriority="51"/>
+    <w:lsdException w:name="Grid Table 7 Colorful Accent 3" w:uiPriority="52"/>
+    <w:lsdException w:name="Grid Table 1 Light Accent 4" w:uiPriority="46"/>
+    <w:lsdException w:name="Grid Table 2 Accent 4" w:uiPriority="47"/>
+    <w:lsdException w:name="Grid Table 3 Accent 4" w:uiPriority="48"/>
+    <w:lsdException w:name="Grid Table 4 Accent 4" w:uiPriority="49"/>
+    <w:lsdException w:name="Grid Table 5 Dark Accent 4" w:uiPriority="50"/>
+    <w:lsdException w:name="Grid Table 6 Colorful Accent 4" w:uiPriority="51"/>
+    <w:lsdException w:name="Grid Table 7 Colorful Accent 4" w:uiPriority="52"/>
+    <w:lsdException w:name="Grid Table 1 Light Accent 5" w:uiPriority="46"/>
+    <w:lsdException w:name="Grid Table 2 Accent 5" w:uiPriority="47"/>
+    <w:lsdException w:name="Grid Table 3 Accent 5" w:uiPriority="48"/>
+    <w:lsdException w:name="Grid Table 4 Accent 5" w:uiPriority="49"/>
+    <w:lsdException w:name="Grid Table 5 Dark Accent 5" w:uiPriority="50"/>
+    <w:lsdException w:name="Grid Table 6 Colorful Accent 5" w:uiPriority="51"/>
+    <w:lsdException w:name="Grid Table 7 Colorful Accent 5" w:uiPriority="52"/>
+    <w:lsdException w:name="Grid Table 1 Light Accent 6" w:uiPriority="46"/>
+    <w:lsdException w:name="Grid Table 2 Accent 6" w:uiPriority="47"/>
+    <w:lsdException w:name="Grid Table 3 Accent 6" w:uiPriority="48"/>
+    <w:lsdException w:name="Grid Table 4 Accent 6" w:uiPriority="49"/>
+    <w:lsdException w:name="Grid Table 5 Dark Accent 6" w:uiPriority="50"/>
+    <w:lsdException w:name="Grid Table 6 Colorful Accent 6" w:uiPriority="51"/>
+    <w:lsdException w:name="Grid Table 7 Colorful Accent 6" w:uiPriority="52"/>
+    <w:lsdException w:name="List Table 1 Light" w:uiPriority="46"/>
+    <w:lsdException w:name="List Table 2" w:uiPriority="47"/>
+    <w:lsdException w:name="List Table 3" w:uiPriority="48"/>
+    <w:lsdException w:name="List Table 4" w:uiPriority="49"/>
+    <w:lsdException w:name="List Table 5 Dark" w:uiPriority="50"/>
+    <w:lsdException w:name="List Table 6 Colorful" w:uiPriority="51"/>
+    <w:lsdException w:name="List Table 7 Colorful" w:uiPriority="52"/>
+    <w:lsdException w:name="List Table 1 Light Accent 1" w:uiPriority="46"/>
+    <w:lsdException w:name="List Table 2 Accent 1" w:uiPriority="47"/>
+    <w:lsdException w:name="List Table 3 Accent 1" w:uiPriority="48"/>
+    <w:lsdException w:name="List Table 4 Accent 1" w:uiPriority="49"/>
+    <w:lsdException w:name="List Table 5 Dark Accent 1" w:uiPriority="50"/>
+    <w:lsdException w:name="List Table 6 Colorful Accent 1" w:uiPriority="51"/>
+    <w:lsdException w:name="List Table 7 Colorful Accent 1" w:uiPriority="52"/>
+    <w:lsdException w:name="List Table 1 Light Accent 2" w:uiPriority="46"/>
+    <w:lsdException w:name="List Table 2 Accent 2" w:uiPriority="47"/>
+    <w:lsdException w:name="List Table 3 Accent 2" w:uiPriority="48"/>
+    <w:lsdException w:name="List Table 4 Accent 2" w:uiPriority="49"/>
+    <w:lsdException w:name="List Table 5 Dark Accent 2" w:uiPriority="50"/>
+    <w:lsdException w:name="List Table 6 Colorful Accent 2" w:uiPriority="51"/>
+    <w:lsdException w:name="List Table 7 Colorful Accent 2" w:uiPriority="52"/>
+    <w:lsdException w:name="List Table 1 Light Accent 3" w:uiPriority="46"/>
+    <w:lsdException w:name="List Table 2 Accent 3" w:uiPriority="47"/>
+    <w:lsdException w:name="List Table 3 Accent 3" w:uiPriority="48"/>
+    <w:lsdException w:name="List Table 4 Accent 3" w:uiPriority="49"/>
+    <w:lsdException w:name="List Table 5 Dark Accent 3" w:uiPriority="50"/>
+    <w:lsdException w:name="List Table 6 Colorful Accent 3" w:uiPriority="51"/>
+    <w:lsdException w:name="List Table 7 Colorful Accent 3" w:uiPriority="52"/>
+    <w:lsdException w:name="List Table 1 Light Accent 4" w:uiPriority="46"/>
+    <w:lsdException w:name="List Table 2 Accent 4" w:uiPriority="47"/>
+    <w:lsdException w:name="List Table 3 Accent 4" w:uiPriority="48"/>
+    <w:lsdException w:name="List Table 4 Accent 4" w:uiPriority="49"/>
+    <w:lsdException w:name="List Table 5 Dark Accent 4" w:uiPriority="50"/>
+    <w:lsdException w:name="List Table 6 Colorful Accent 4" w:uiPriority="51"/>
+    <w:lsdException w:name="List Table 7 Colorful Accent 4" w:uiPriority="52"/>
+    <w:lsdException w:name="List Table 1 Light Accent 5" w:uiPriority="46"/>
+    <w:lsdException w:name="List Table 2 Accent 5" w:uiPriority="47"/>
+    <w:lsdException w:name="List Table 3 Accent 5" w:uiPriority="48"/>
+    <w:lsdException w:name="List Table 4 Accent 5" w:uiPriority="49"/>
+    <w:lsdException w:name="List Table 5 Dark Accent 5" w:uiPriority="50"/>
+    <w:lsdException w:name="List Table 6 Colorful Accent 5" w:uiPriority="51"/>
+    <w:lsdException w:name="List Table 7 Colorful Accent 5" w:uiPriority="52"/>
+    <w:lsdException w:name="List Table 1 Light Accent 6" w:uiPriority="46"/>
+    <w:lsdException w:name="List Table 2 Accent 6" w:uiPriority="47"/>
+    <w:lsdException w:name="List Table 3 Accent 6" w:uiPriority="48"/>
+    <w:lsdException w:name="List Table 4 Accent 6" w:uiPriority="49"/>
+    <w:lsdException w:name="List Table 5 Dark Accent 6" w:uiPriority="50"/>
+    <w:lsdException w:name="List Table 6 Colorful Accent 6" w:uiPriority="51"/>
+    <w:lsdException w:name="List Table 7 Colorful Accent 6" w:uiPriority="52"/>
+    <w:lsdException w:name="Mention" w:semiHidden="1" w:unhideWhenUsed="1"/>
+    <w:lsdException w:name="Smart Hyperlink" w:semiHidden="1" w:unhideWhenUsed="1"/>
+    <w:lsdException w:name="Hashtag" w:semiHidden="1" w:unhideWhenUsed="1"/>
+    <w:lsdException w:name="Unresolved Mention" w:semiHidden="1" w:unhideWhenUsed="1"/>
+    <w:lsdException w:name="Smart Link" w:semiHidden="1" w:unhideWhenUsed="1"/>
+  </w:latentStyles>
+  <w:style w:type="paragraph" w:default="1" w:styleId="Standard">
+    <w:name w:val="Normal"/>
+    <w:qFormat/>
   </w:style>
-  <w:style w:type="table" w:styleId="TableNormal" w:default="1">
-    <w:name w:val="TableNormal"/>
-  </w:style>
-  <w:style w:type="paragraph" w:styleId="Heading1">
+  <w:style w:type="paragraph" w:styleId="berschrift1">
     <w:name w:val="heading 1"/>
-    <w:basedOn w:val="Normal"/>
-    <w:next w:val="Normal"/>
+    <w:basedOn w:val="Standard"/>
+    <w:next w:val="Standard"/>
+    <w:uiPriority w:val="9"/>
+    <w:qFormat/>
     <w:pPr>
-      <w:keepNext w:val="1"/>
-      <w:keepLines w:val="1"/>
-      <w:pageBreakBefore w:val="0"/>
-      <w:spacing w:after="120" w:before="400" w:lineRule="auto"/>
+      <w:keepNext/>
+      <w:keepLines/>
+      <w:spacing w:before="400" w:after="120"/>
+      <w:outlineLvl w:val="0"/>
     </w:pPr>
     <w:rPr>
       <w:sz w:val="40"/>
       <w:szCs w:val="40"/>
     </w:rPr>
   </w:style>
-  <w:style w:type="paragraph" w:styleId="Heading2">
+  <w:style w:type="paragraph" w:styleId="berschrift2">
     <w:name w:val="heading 2"/>
-    <w:basedOn w:val="Normal"/>
-    <w:next w:val="Normal"/>
+    <w:basedOn w:val="Standard"/>
+    <w:next w:val="Standard"/>
+    <w:uiPriority w:val="9"/>
+    <w:unhideWhenUsed/>
+    <w:qFormat/>
     <w:pPr>
-      <w:keepNext w:val="1"/>
-      <w:keepLines w:val="1"/>
-      <w:pageBreakBefore w:val="0"/>
-      <w:spacing w:after="120" w:before="360" w:lineRule="auto"/>
+      <w:keepNext/>
+      <w:keepLines/>
+      <w:spacing w:before="360" w:after="120"/>
+      <w:outlineLvl w:val="1"/>
     </w:pPr>
     <w:rPr>
-      <w:b w:val="0"/>
       <w:sz w:val="32"/>
       <w:szCs w:val="32"/>
     </w:rPr>
   </w:style>
-  <w:style w:type="paragraph" w:styleId="Heading3">
+  <w:style w:type="paragraph" w:styleId="berschrift3">
     <w:name w:val="heading 3"/>
-    <w:basedOn w:val="Normal"/>
-    <w:next w:val="Normal"/>
+    <w:basedOn w:val="Standard"/>
+    <w:next w:val="Standard"/>
+    <w:uiPriority w:val="9"/>
+    <w:semiHidden/>
+    <w:unhideWhenUsed/>
+    <w:qFormat/>
     <w:pPr>
-      <w:keepNext w:val="1"/>
-      <w:keepLines w:val="1"/>
-      <w:pageBreakBefore w:val="0"/>
-      <w:spacing w:after="80" w:before="320" w:lineRule="auto"/>
+      <w:keepNext/>
+      <w:keepLines/>
+      <w:spacing w:before="320" w:after="80"/>
+      <w:outlineLvl w:val="2"/>
     </w:pPr>
     <w:rPr>
-      <w:b w:val="0"/>
       <w:color w:val="434343"/>
       <w:sz w:val="28"/>
       <w:szCs w:val="28"/>
     </w:rPr>
   </w:style>
-  <w:style w:type="paragraph" w:styleId="Heading4">
+  <w:style w:type="paragraph" w:styleId="berschrift4">
     <w:name w:val="heading 4"/>
-    <w:basedOn w:val="Normal"/>
-    <w:next w:val="Normal"/>
+    <w:basedOn w:val="Standard"/>
+    <w:next w:val="Standard"/>
+    <w:uiPriority w:val="9"/>
+    <w:semiHidden/>
+    <w:unhideWhenUsed/>
+    <w:qFormat/>
     <w:pPr>
-      <w:keepNext w:val="1"/>
-      <w:keepLines w:val="1"/>
-      <w:pageBreakBefore w:val="0"/>
-      <w:spacing w:after="80" w:before="280" w:lineRule="auto"/>
+      <w:keepNext/>
+      <w:keepLines/>
+      <w:spacing w:before="280" w:after="80"/>
+      <w:outlineLvl w:val="3"/>
     </w:pPr>
     <w:rPr>
       <w:color w:val="666666"/>
@@ -1894,95 +2084,137 @@
       <w:szCs w:val="24"/>
     </w:rPr>
   </w:style>
-  <w:style w:type="paragraph" w:styleId="Heading5">
+  <w:style w:type="paragraph" w:styleId="berschrift5">
     <w:name w:val="heading 5"/>
-    <w:basedOn w:val="Normal"/>
-    <w:next w:val="Normal"/>
+    <w:basedOn w:val="Standard"/>
+    <w:next w:val="Standard"/>
+    <w:uiPriority w:val="9"/>
+    <w:semiHidden/>
+    <w:unhideWhenUsed/>
+    <w:qFormat/>
     <w:pPr>
-      <w:keepNext w:val="1"/>
-      <w:keepLines w:val="1"/>
-      <w:pageBreakBefore w:val="0"/>
-      <w:spacing w:after="80" w:before="240" w:lineRule="auto"/>
+      <w:keepNext/>
+      <w:keepLines/>
+      <w:spacing w:before="240" w:after="80"/>
+      <w:outlineLvl w:val="4"/>
     </w:pPr>
     <w:rPr>
       <w:color w:val="666666"/>
-      <w:sz w:val="22"/>
-      <w:szCs w:val="22"/>
     </w:rPr>
   </w:style>
-  <w:style w:type="paragraph" w:styleId="Heading6">
+  <w:style w:type="paragraph" w:styleId="berschrift6">
     <w:name w:val="heading 6"/>
-    <w:basedOn w:val="Normal"/>
-    <w:next w:val="Normal"/>
+    <w:basedOn w:val="Standard"/>
+    <w:next w:val="Standard"/>
+    <w:uiPriority w:val="9"/>
+    <w:semiHidden/>
+    <w:unhideWhenUsed/>
+    <w:qFormat/>
     <w:pPr>
-      <w:keepNext w:val="1"/>
-      <w:keepLines w:val="1"/>
-      <w:pageBreakBefore w:val="0"/>
-      <w:spacing w:after="80" w:before="240" w:lineRule="auto"/>
+      <w:keepNext/>
+      <w:keepLines/>
+      <w:spacing w:before="240" w:after="80"/>
+      <w:outlineLvl w:val="5"/>
     </w:pPr>
     <w:rPr>
-      <w:i w:val="1"/>
+      <w:i/>
       <w:color w:val="666666"/>
-      <w:sz w:val="22"/>
-      <w:szCs w:val="22"/>
     </w:rPr>
   </w:style>
-  <w:style w:type="paragraph" w:styleId="Title">
+  <w:style w:type="character" w:default="1" w:styleId="Absatz-Standardschriftart">
+    <w:name w:val="Default Paragraph Font"/>
+    <w:uiPriority w:val="1"/>
+    <w:semiHidden/>
+    <w:unhideWhenUsed/>
+  </w:style>
+  <w:style w:type="table" w:default="1" w:styleId="NormaleTabelle">
+    <w:name w:val="Normal Table"/>
+    <w:uiPriority w:val="99"/>
+    <w:semiHidden/>
+    <w:unhideWhenUsed/>
+    <w:tblPr>
+      <w:tblInd w:w="0" w:type="dxa"/>
+      <w:tblCellMar>
+        <w:top w:w="0" w:type="dxa"/>
+        <w:left w:w="108" w:type="dxa"/>
+        <w:bottom w:w="0" w:type="dxa"/>
+        <w:right w:w="108" w:type="dxa"/>
+      </w:tblCellMar>
+    </w:tblPr>
+  </w:style>
+  <w:style w:type="numbering" w:default="1" w:styleId="KeineListe">
+    <w:name w:val="No List"/>
+    <w:uiPriority w:val="99"/>
+    <w:semiHidden/>
+    <w:unhideWhenUsed/>
+  </w:style>
+  <w:style w:type="table" w:customStyle="1" w:styleId="TableNormal">
+    <w:name w:val="TableNormal"/>
+    <w:tblPr>
+      <w:tblCellMar>
+        <w:top w:w="0" w:type="dxa"/>
+        <w:left w:w="0" w:type="dxa"/>
+        <w:bottom w:w="0" w:type="dxa"/>
+        <w:right w:w="0" w:type="dxa"/>
+      </w:tblCellMar>
+    </w:tblPr>
+  </w:style>
+  <w:style w:type="paragraph" w:styleId="Titel">
     <w:name w:val="Title"/>
-    <w:basedOn w:val="Normal"/>
-    <w:next w:val="Normal"/>
+    <w:basedOn w:val="Standard"/>
+    <w:next w:val="Standard"/>
+    <w:uiPriority w:val="10"/>
+    <w:qFormat/>
     <w:pPr>
-      <w:keepNext w:val="1"/>
-      <w:keepLines w:val="1"/>
-      <w:pageBreakBefore w:val="0"/>
-      <w:spacing w:after="60" w:before="0" w:lineRule="auto"/>
+      <w:keepNext/>
+      <w:keepLines/>
+      <w:spacing w:after="60"/>
     </w:pPr>
     <w:rPr>
       <w:sz w:val="52"/>
       <w:szCs w:val="52"/>
     </w:rPr>
   </w:style>
-  <w:style w:type="paragraph" w:styleId="Subtitle">
+  <w:style w:type="paragraph" w:styleId="Untertitel">
     <w:name w:val="Subtitle"/>
-    <w:basedOn w:val="Normal"/>
-    <w:next w:val="Normal"/>
+    <w:basedOn w:val="Standard"/>
+    <w:next w:val="Standard"/>
+    <w:uiPriority w:val="11"/>
+    <w:qFormat/>
     <w:pPr>
-      <w:keepNext w:val="1"/>
-      <w:keepLines w:val="1"/>
-      <w:pageBreakBefore w:val="0"/>
-      <w:spacing w:after="320" w:before="0" w:lineRule="auto"/>
+      <w:keepNext/>
+      <w:keepLines/>
+      <w:spacing w:after="320"/>
     </w:pPr>
     <w:rPr>
-      <w:rFonts w:ascii="Arial" w:cs="Arial" w:eastAsia="Arial" w:hAnsi="Arial"/>
-      <w:i w:val="0"/>
       <w:color w:val="666666"/>
       <w:sz w:val="30"/>
       <w:szCs w:val="30"/>
     </w:rPr>
   </w:style>
-  <w:style w:type="table" w:styleId="Table1">
+  <w:style w:type="table" w:customStyle="1" w:styleId="a">
     <w:basedOn w:val="TableNormal"/>
     <w:tblPr>
       <w:tblStyleRowBandSize w:val="1"/>
       <w:tblStyleColBandSize w:val="1"/>
       <w:tblCellMar>
-        <w:top w:w="100.0" w:type="dxa"/>
-        <w:left w:w="100.0" w:type="dxa"/>
-        <w:bottom w:w="100.0" w:type="dxa"/>
-        <w:right w:w="100.0" w:type="dxa"/>
+        <w:top w:w="100" w:type="dxa"/>
+        <w:left w:w="100" w:type="dxa"/>
+        <w:bottom w:w="100" w:type="dxa"/>
+        <w:right w:w="100" w:type="dxa"/>
       </w:tblCellMar>
     </w:tblPr>
   </w:style>
-  <w:style w:type="table" w:styleId="Table2">
+  <w:style w:type="table" w:customStyle="1" w:styleId="a0">
     <w:basedOn w:val="TableNormal"/>
     <w:tblPr>
       <w:tblStyleRowBandSize w:val="1"/>
       <w:tblStyleColBandSize w:val="1"/>
       <w:tblCellMar>
-        <w:top w:w="100.0" w:type="dxa"/>
-        <w:left w:w="100.0" w:type="dxa"/>
-        <w:bottom w:w="100.0" w:type="dxa"/>
-        <w:right w:w="100.0" w:type="dxa"/>
+        <w:top w:w="100" w:type="dxa"/>
+        <w:left w:w="100" w:type="dxa"/>
+        <w:bottom w:w="100" w:type="dxa"/>
+        <w:right w:w="100" w:type="dxa"/>
       </w:tblCellMar>
     </w:tblPr>
   </w:style>

</xml_diff>